<commit_message>
Mise a jour de la documentation
</commit_message>
<xml_diff>
--- a/doc/Guide_Integration_API_Exemple_Simple.docx
+++ b/doc/Guide_Integration_API_Exemple_Simple.docx
@@ -13,49 +13,37 @@
         <w:rPr>
           <w:lang w:val="fr-CA"/>
         </w:rPr>
-        <w:t xml:space="preserve">Guide d </w:t>
-      </w:r>
-      <w:proofErr w:type="spellStart"/>
-      <w:r>
-        <w:rPr>
-          <w:lang w:val="fr-CA"/>
-        </w:rPr>
-        <w:t>integration</w:t>
-      </w:r>
-      <w:proofErr w:type="spellEnd"/>
-      <w:r>
-        <w:rPr>
-          <w:lang w:val="fr-CA"/>
-        </w:rPr>
-        <w:t xml:space="preserve"> de </w:t>
-      </w:r>
-      <w:proofErr w:type="spellStart"/>
-      <w:r>
-        <w:rPr>
-          <w:lang w:val="fr-CA"/>
-        </w:rPr>
-        <w:t>l API</w:t>
-      </w:r>
-      <w:proofErr w:type="spellEnd"/>
-      <w:r>
-        <w:rPr>
-          <w:lang w:val="fr-CA"/>
-        </w:rPr>
-        <w:t xml:space="preserve"> </w:t>
-      </w:r>
-      <w:proofErr w:type="spellStart"/>
-      <w:r>
-        <w:rPr>
-          <w:lang w:val="fr-CA"/>
-        </w:rPr>
-        <w:t>NutriFAQ</w:t>
-      </w:r>
-      <w:proofErr w:type="spellEnd"/>
-      <w:r>
-        <w:rPr>
-          <w:lang w:val="fr-CA"/>
-        </w:rPr>
-        <w:t xml:space="preserve"> (exemple simple)</w:t>
+        <w:t>Guide d</w:t>
+      </w:r>
+      <w:r>
+        <w:rPr>
+          <w:lang w:val="fr-CA"/>
+        </w:rPr>
+        <w:t>’</w:t>
+      </w:r>
+      <w:r>
+        <w:rPr>
+          <w:lang w:val="fr-CA"/>
+        </w:rPr>
+        <w:t>intégration</w:t>
+      </w:r>
+      <w:r>
+        <w:rPr>
+          <w:lang w:val="fr-CA"/>
+        </w:rPr>
+        <w:t xml:space="preserve"> de l</w:t>
+      </w:r>
+      <w:r>
+        <w:rPr>
+          <w:lang w:val="fr-CA"/>
+        </w:rPr>
+        <w:t>’</w:t>
+      </w:r>
+      <w:r>
+        <w:rPr>
+          <w:lang w:val="fr-CA"/>
+        </w:rPr>
+        <w:t>API NutriFAQ</w:t>
       </w:r>
     </w:p>
     <w:p>
@@ -119,35 +107,7 @@
         <w:rPr>
           <w:lang w:val="fr-CA"/>
         </w:rPr>
-        <w:t xml:space="preserve">API </w:t>
-      </w:r>
-      <w:proofErr w:type="spellStart"/>
-      <w:r>
-        <w:rPr>
-          <w:lang w:val="fr-CA"/>
-        </w:rPr>
-        <w:t>NutriFAQ</w:t>
-      </w:r>
-      <w:proofErr w:type="spellEnd"/>
-      <w:r>
-        <w:rPr>
-          <w:lang w:val="fr-CA"/>
-        </w:rPr>
-        <w:t xml:space="preserve"> avec le frontend minimal situe dans </w:t>
-      </w:r>
-      <w:proofErr w:type="spellStart"/>
-      <w:r>
-        <w:rPr>
-          <w:lang w:val="fr-CA"/>
-        </w:rPr>
-        <w:t>example</w:t>
-      </w:r>
-      <w:proofErr w:type="spellEnd"/>
-      <w:r>
-        <w:rPr>
-          <w:lang w:val="fr-CA"/>
-        </w:rPr>
-        <w:t>/simple-frontend-chat.</w:t>
+        <w:t>API NutriFAQ avec le frontend minimal situe dans simple-frontend-chat.</w:t>
       </w:r>
     </w:p>
     <w:p>
@@ -185,21 +145,7 @@
         <w:rPr>
           <w:lang w:val="fr-CA"/>
         </w:rPr>
-        <w:t xml:space="preserve">Backend </w:t>
-      </w:r>
-      <w:proofErr w:type="spellStart"/>
-      <w:r>
-        <w:rPr>
-          <w:lang w:val="fr-CA"/>
-        </w:rPr>
-        <w:t>NutriFAQ</w:t>
-      </w:r>
-      <w:proofErr w:type="spellEnd"/>
-      <w:r>
-        <w:rPr>
-          <w:lang w:val="fr-CA"/>
-        </w:rPr>
-        <w:t xml:space="preserve"> accessible (local ou d</w:t>
+        <w:t>Backend NutriFAQ accessible (local ou d</w:t>
       </w:r>
       <w:r>
         <w:rPr>
@@ -265,21 +211,13 @@
         <w:rPr>
           <w:lang w:val="fr-CA"/>
         </w:rPr>
-        <w:t>s valide QUERY_ACCESS_KEY si vous utilisez la voie /</w:t>
-      </w:r>
-      <w:proofErr w:type="spellStart"/>
-      <w:r>
-        <w:rPr>
-          <w:lang w:val="fr-CA"/>
-        </w:rPr>
-        <w:t>query</w:t>
-      </w:r>
-      <w:proofErr w:type="spellEnd"/>
-      <w:r>
-        <w:rPr>
-          <w:lang w:val="fr-CA"/>
-        </w:rPr>
-        <w:t>.</w:t>
+        <w:t>s valide QUERY_ACCESS_KEY si vous utilisez la voie /query</w:t>
+      </w:r>
+      <w:r>
+        <w:rPr>
+          <w:lang w:val="fr-CA"/>
+        </w:rPr>
+        <w:t xml:space="preserve"> et /download_page.</w:t>
       </w:r>
     </w:p>
     <w:p>
@@ -337,14 +275,6 @@
           <w:lang w:val="fr-CA"/>
         </w:rPr>
       </w:pPr>
-      <w:proofErr w:type="spellStart"/>
-      <w:r>
-        <w:rPr>
-          <w:lang w:val="fr-CA"/>
-        </w:rPr>
-        <w:t>example</w:t>
-      </w:r>
-      <w:proofErr w:type="spellEnd"/>
       <w:r>
         <w:rPr>
           <w:lang w:val="fr-CA"/>
@@ -363,14 +293,6 @@
           <w:lang w:val="fr-CA"/>
         </w:rPr>
       </w:pPr>
-      <w:proofErr w:type="spellStart"/>
-      <w:r>
-        <w:rPr>
-          <w:lang w:val="fr-CA"/>
-        </w:rPr>
-        <w:t>example</w:t>
-      </w:r>
-      <w:proofErr w:type="spellEnd"/>
       <w:r>
         <w:rPr>
           <w:lang w:val="fr-CA"/>
@@ -387,21 +309,7 @@
         <w:rPr>
           <w:lang w:val="fr-CA"/>
         </w:rPr>
-        <w:t xml:space="preserve">envoi, streaming SSE, rendu </w:t>
-      </w:r>
-      <w:proofErr w:type="spellStart"/>
-      <w:r>
-        <w:rPr>
-          <w:lang w:val="fr-CA"/>
-        </w:rPr>
-        <w:t>markdown</w:t>
-      </w:r>
-      <w:proofErr w:type="spellEnd"/>
-      <w:r>
-        <w:rPr>
-          <w:lang w:val="fr-CA"/>
-        </w:rPr>
-        <w:t>.</w:t>
+        <w:t>envoi, streaming SSE, rendu markdown.</w:t>
       </w:r>
     </w:p>
     <w:p>
@@ -415,14 +323,6 @@
           <w:lang w:val="fr-CA"/>
         </w:rPr>
       </w:pPr>
-      <w:proofErr w:type="spellStart"/>
-      <w:r>
-        <w:rPr>
-          <w:lang w:val="fr-CA"/>
-        </w:rPr>
-        <w:t>example</w:t>
-      </w:r>
-      <w:proofErr w:type="spellEnd"/>
       <w:r>
         <w:rPr>
           <w:lang w:val="fr-CA"/>
@@ -439,21 +339,7 @@
         <w:rPr>
           <w:lang w:val="fr-CA"/>
         </w:rPr>
-        <w:t xml:space="preserve">URL API et de la </w:t>
-      </w:r>
-      <w:proofErr w:type="spellStart"/>
-      <w:r>
-        <w:rPr>
-          <w:lang w:val="fr-CA"/>
-        </w:rPr>
-        <w:t>cle</w:t>
-      </w:r>
-      <w:proofErr w:type="spellEnd"/>
-      <w:r>
-        <w:rPr>
-          <w:lang w:val="fr-CA"/>
-        </w:rPr>
-        <w:t xml:space="preserve"> d</w:t>
+        <w:t>URL API et de la cle d</w:t>
       </w:r>
       <w:r>
         <w:rPr>
@@ -491,14 +377,6 @@
           <w:lang w:val="fr-CA"/>
         </w:rPr>
       </w:pPr>
-      <w:proofErr w:type="spellStart"/>
-      <w:r>
-        <w:rPr>
-          <w:lang w:val="fr-CA"/>
-        </w:rPr>
-        <w:t>example</w:t>
-      </w:r>
-      <w:proofErr w:type="spellEnd"/>
       <w:r>
         <w:rPr>
           <w:lang w:val="fr-CA"/>
@@ -550,19 +428,11 @@
           <w:lang w:val="fr-CA"/>
         </w:rPr>
       </w:pPr>
-      <w:proofErr w:type="spellStart"/>
-      <w:r>
-        <w:rPr>
-          <w:lang w:val="fr-CA"/>
-        </w:rPr>
-        <w:t>window.API_BASE</w:t>
-      </w:r>
-      <w:proofErr w:type="spellEnd"/>
-      <w:r>
-        <w:rPr>
-          <w:lang w:val="fr-CA"/>
-        </w:rPr>
-        <w:t xml:space="preserve"> = "https://</w:t>
+      <w:r>
+        <w:rPr>
+          <w:lang w:val="fr-CA"/>
+        </w:rPr>
+        <w:t>window.API_BASE = "https://</w:t>
       </w:r>
       <w:r>
         <w:rPr>
@@ -588,27 +458,11 @@
           <w:lang w:val="fr-CA"/>
         </w:rPr>
       </w:pPr>
-      <w:proofErr w:type="spellStart"/>
-      <w:proofErr w:type="gramStart"/>
-      <w:r>
-        <w:rPr>
-          <w:lang w:val="fr-CA"/>
-        </w:rPr>
-        <w:t>window.CLIENT</w:t>
-      </w:r>
-      <w:proofErr w:type="gramEnd"/>
-      <w:r>
-        <w:rPr>
-          <w:lang w:val="fr-CA"/>
-        </w:rPr>
-        <w:t>_QUERY_KEY</w:t>
-      </w:r>
-      <w:proofErr w:type="spellEnd"/>
-      <w:r>
-        <w:rPr>
-          <w:lang w:val="fr-CA"/>
-        </w:rPr>
-        <w:t xml:space="preserve"> = "</w:t>
+      <w:r>
+        <w:rPr>
+          <w:lang w:val="fr-CA"/>
+        </w:rPr>
+        <w:t>window.CLIENT_QUERY_KEY = "</w:t>
       </w:r>
       <w:r>
         <w:rPr>
@@ -620,28 +474,7 @@
         <w:rPr>
           <w:lang w:val="fr-CA"/>
         </w:rPr>
-        <w:t>-</w:t>
-      </w:r>
-      <w:proofErr w:type="spellStart"/>
-      <w:r>
-        <w:rPr>
-          <w:lang w:val="fr-CA"/>
-        </w:rPr>
-        <w:t>cle</w:t>
-      </w:r>
-      <w:proofErr w:type="spellEnd"/>
-      <w:r>
-        <w:rPr>
-          <w:lang w:val="fr-CA"/>
-        </w:rPr>
-        <w:t>-</w:t>
-      </w:r>
-      <w:proofErr w:type="spellStart"/>
-      <w:r>
-        <w:rPr>
-          <w:lang w:val="fr-CA"/>
-        </w:rPr>
-        <w:t>query</w:t>
+        <w:t>-cle-query</w:t>
       </w:r>
       <w:r>
         <w:rPr>
@@ -649,7 +482,6 @@
         </w:rPr>
         <w:t>_fournie</w:t>
       </w:r>
-      <w:proofErr w:type="spellEnd"/>
       <w:r>
         <w:rPr>
           <w:lang w:val="fr-CA"/>
@@ -668,459 +500,62 @@
         <w:rPr>
           <w:lang w:val="fr-CA"/>
         </w:rPr>
-        <w:t>5. Flux technique utilis</w:t>
-      </w:r>
-      <w:r>
-        <w:rPr>
-          <w:lang w:val="fr-CA"/>
-        </w:rPr>
-        <w:t>é</w:t>
-      </w:r>
-      <w:r>
-        <w:rPr>
-          <w:lang w:val="fr-CA"/>
-        </w:rPr>
-        <w:t xml:space="preserve"> par l</w:t>
-      </w:r>
-      <w:r>
-        <w:rPr>
-          <w:lang w:val="fr-CA"/>
-        </w:rPr>
-        <w:t>’</w:t>
-      </w:r>
-      <w:r>
-        <w:rPr>
-          <w:lang w:val="fr-CA"/>
-        </w:rPr>
-        <w:t>exemple</w:t>
-      </w:r>
-    </w:p>
-    <w:p>
-      <w:pPr>
-        <w:pStyle w:val="Paragraphedeliste"/>
-        <w:numPr>
-          <w:ilvl w:val="0"/>
-          <w:numId w:val="12"/>
-        </w:numPr>
-        <w:rPr>
-          <w:lang w:val="fr-CA"/>
-        </w:rPr>
-      </w:pPr>
-      <w:r>
-        <w:rPr>
-          <w:lang w:val="fr-CA"/>
-        </w:rPr>
-        <w:t>L</w:t>
-      </w:r>
-      <w:r>
-        <w:rPr>
-          <w:lang w:val="fr-CA"/>
-        </w:rPr>
-        <w:t>’</w:t>
-      </w:r>
-      <w:r>
-        <w:rPr>
-          <w:lang w:val="fr-CA"/>
-        </w:rPr>
-        <w:t>utilisateur soumet une question dans le formulaire.</w:t>
-      </w:r>
-    </w:p>
-    <w:p>
-      <w:pPr>
-        <w:pStyle w:val="Paragraphedeliste"/>
-        <w:numPr>
-          <w:ilvl w:val="0"/>
-          <w:numId w:val="12"/>
-        </w:numPr>
-        <w:rPr>
-          <w:lang w:val="fr-CA"/>
-        </w:rPr>
-      </w:pPr>
-      <w:r>
-        <w:rPr>
-          <w:lang w:val="fr-CA"/>
-        </w:rPr>
-        <w:t>app.js appelle POST /</w:t>
-      </w:r>
-      <w:proofErr w:type="spellStart"/>
-      <w:r>
-        <w:rPr>
-          <w:lang w:val="fr-CA"/>
-        </w:rPr>
-        <w:t>query</w:t>
-      </w:r>
-      <w:proofErr w:type="spellEnd"/>
-      <w:r>
-        <w:rPr>
-          <w:lang w:val="fr-CA"/>
-        </w:rPr>
-        <w:t xml:space="preserve"> sur API_BASE.</w:t>
-      </w:r>
-    </w:p>
-    <w:p>
-      <w:pPr>
-        <w:pStyle w:val="Paragraphedeliste"/>
-        <w:numPr>
-          <w:ilvl w:val="0"/>
-          <w:numId w:val="12"/>
-        </w:numPr>
-        <w:rPr>
-          <w:lang w:val="fr-CA"/>
-        </w:rPr>
-      </w:pPr>
-      <w:r>
-        <w:rPr>
-          <w:lang w:val="fr-CA"/>
-        </w:rPr>
-        <w:t>Si CLIENT_QUERY_KEY est d</w:t>
-      </w:r>
-      <w:r>
-        <w:rPr>
-          <w:lang w:val="fr-CA"/>
-        </w:rPr>
-        <w:t>é</w:t>
-      </w:r>
-      <w:r>
-        <w:rPr>
-          <w:lang w:val="fr-CA"/>
-        </w:rPr>
-        <w:t>fini, le header X-Client-Key est envoy</w:t>
-      </w:r>
-      <w:r>
-        <w:rPr>
-          <w:lang w:val="fr-CA"/>
-        </w:rPr>
-        <w:t>é</w:t>
-      </w:r>
-      <w:r>
-        <w:rPr>
-          <w:lang w:val="fr-CA"/>
-        </w:rPr>
-        <w:t>.</w:t>
-      </w:r>
-    </w:p>
-    <w:p>
-      <w:pPr>
-        <w:pStyle w:val="Paragraphedeliste"/>
-        <w:numPr>
-          <w:ilvl w:val="0"/>
-          <w:numId w:val="12"/>
-        </w:numPr>
-        <w:rPr>
-          <w:lang w:val="fr-CA"/>
-        </w:rPr>
-      </w:pPr>
-      <w:r>
-        <w:rPr>
-          <w:lang w:val="fr-CA"/>
-        </w:rPr>
-        <w:t>Le backend retourne un flux SSE (</w:t>
-      </w:r>
-      <w:proofErr w:type="spellStart"/>
-      <w:r>
-        <w:rPr>
-          <w:lang w:val="fr-CA"/>
-        </w:rPr>
-        <w:t>text</w:t>
-      </w:r>
-      <w:proofErr w:type="spellEnd"/>
-      <w:r>
-        <w:rPr>
-          <w:lang w:val="fr-CA"/>
-        </w:rPr>
-        <w:t>/</w:t>
-      </w:r>
-      <w:proofErr w:type="spellStart"/>
-      <w:r>
-        <w:rPr>
-          <w:lang w:val="fr-CA"/>
-        </w:rPr>
-        <w:t>event-stream</w:t>
-      </w:r>
-      <w:proofErr w:type="spellEnd"/>
-      <w:r>
-        <w:rPr>
-          <w:lang w:val="fr-CA"/>
-        </w:rPr>
-        <w:t>).</w:t>
-      </w:r>
-    </w:p>
-    <w:p>
-      <w:pPr>
-        <w:pStyle w:val="Paragraphedeliste"/>
-        <w:numPr>
-          <w:ilvl w:val="0"/>
-          <w:numId w:val="12"/>
-        </w:numPr>
-        <w:rPr>
-          <w:lang w:val="fr-CA"/>
-        </w:rPr>
-      </w:pPr>
-      <w:r>
-        <w:rPr>
-          <w:lang w:val="fr-CA"/>
-        </w:rPr>
-        <w:t xml:space="preserve">Le frontend lit les </w:t>
-      </w:r>
-      <w:proofErr w:type="spellStart"/>
-      <w:r>
-        <w:rPr>
-          <w:lang w:val="fr-CA"/>
-        </w:rPr>
-        <w:t>chunks</w:t>
-      </w:r>
-      <w:proofErr w:type="spellEnd"/>
-      <w:r>
-        <w:rPr>
-          <w:lang w:val="fr-CA"/>
-        </w:rPr>
-        <w:t xml:space="preserve"> et met </w:t>
-      </w:r>
-      <w:r>
-        <w:rPr>
-          <w:lang w:val="fr-CA"/>
-        </w:rPr>
-        <w:t>à</w:t>
-      </w:r>
-      <w:r>
-        <w:rPr>
-          <w:lang w:val="fr-CA"/>
-        </w:rPr>
-        <w:t xml:space="preserve"> jour la bulle assistant en temps r</w:t>
-      </w:r>
-      <w:r>
-        <w:rPr>
-          <w:lang w:val="fr-CA"/>
-        </w:rPr>
-        <w:t>é</w:t>
-      </w:r>
-      <w:r>
-        <w:rPr>
-          <w:lang w:val="fr-CA"/>
-        </w:rPr>
-        <w:t>el.</w:t>
-      </w:r>
-    </w:p>
-    <w:p>
-      <w:pPr>
-        <w:pStyle w:val="Titre2"/>
-        <w:rPr>
-          <w:lang w:val="fr-CA"/>
-        </w:rPr>
-      </w:pPr>
-      <w:r>
-        <w:rPr>
-          <w:lang w:val="fr-CA"/>
-        </w:rPr>
-        <w:t>6. Contrat API attendu (route /</w:t>
-      </w:r>
-      <w:proofErr w:type="spellStart"/>
-      <w:r>
-        <w:rPr>
-          <w:lang w:val="fr-CA"/>
-        </w:rPr>
-        <w:t>query</w:t>
-      </w:r>
-      <w:proofErr w:type="spellEnd"/>
-      <w:r>
-        <w:rPr>
-          <w:lang w:val="fr-CA"/>
-        </w:rPr>
-        <w:t>)</w:t>
-      </w:r>
-    </w:p>
-    <w:p>
-      <w:pPr>
-        <w:rPr>
-          <w:lang w:val="fr-CA"/>
-        </w:rPr>
-      </w:pPr>
-      <w:proofErr w:type="spellStart"/>
-      <w:r>
-        <w:rPr>
+        <w:t xml:space="preserve">6. </w:t>
+      </w:r>
+      <w:r>
+        <w:rPr>
+          <w:lang w:val="fr-CA"/>
+        </w:rPr>
+        <w:t>Services</w:t>
+      </w:r>
+      <w:r>
+        <w:rPr>
+          <w:lang w:val="fr-CA"/>
+        </w:rPr>
+        <w:t xml:space="preserve"> API </w:t>
+      </w:r>
+    </w:p>
+    <w:p>
+      <w:pPr>
+        <w:pStyle w:val="Titre1"/>
+        <w:shd w:val="clear" w:color="auto" w:fill="C1E4F5" w:themeFill="accent1" w:themeFillTint="33"/>
+        <w:rPr>
+          <w:b/>
+          <w:bCs/>
+          <w:lang w:val="fr-CA"/>
+        </w:rPr>
+      </w:pPr>
+      <w:r>
+        <w:rPr>
+          <w:lang w:val="fr-CA"/>
+        </w:rPr>
+        <w:t>/query</w:t>
+      </w:r>
+      <w:r>
+        <w:rPr>
+          <w:b/>
+          <w:bCs/>
+          <w:lang w:val="fr-CA"/>
+        </w:rPr>
+        <w:t xml:space="preserve"> </w:t>
+      </w:r>
+    </w:p>
+    <w:p>
+      <w:pPr>
+        <w:ind w:left="360"/>
+        <w:rPr>
+          <w:b/>
+          <w:bCs/>
+          <w:lang w:val="fr-CA"/>
+        </w:rPr>
+      </w:pPr>
+      <w:r>
+        <w:rPr>
+          <w:b/>
+          <w:bCs/>
           <w:lang w:val="fr-CA"/>
         </w:rPr>
         <w:t>Request</w:t>
-      </w:r>
-      <w:proofErr w:type="spellEnd"/>
-      <w:r>
-        <w:rPr>
-          <w:lang w:val="fr-CA"/>
-        </w:rPr>
-        <w:t>:</w:t>
-      </w:r>
-    </w:p>
-    <w:p>
-      <w:pPr>
-        <w:pStyle w:val="Paragraphedeliste"/>
-        <w:numPr>
-          <w:ilvl w:val="0"/>
-          <w:numId w:val="15"/>
-        </w:numPr>
-        <w:rPr>
-          <w:lang w:val="fr-CA"/>
-        </w:rPr>
-      </w:pPr>
-      <w:r>
-        <w:rPr>
-          <w:lang w:val="fr-CA"/>
-        </w:rPr>
-        <w:t>Method: POST</w:t>
-      </w:r>
-    </w:p>
-    <w:p>
-      <w:pPr>
-        <w:pStyle w:val="Paragraphedeliste"/>
-        <w:numPr>
-          <w:ilvl w:val="0"/>
-          <w:numId w:val="15"/>
-        </w:numPr>
-        <w:rPr>
-          <w:lang w:val="fr-CA"/>
-        </w:rPr>
-      </w:pPr>
-      <w:r>
-        <w:rPr>
-          <w:lang w:val="fr-CA"/>
-        </w:rPr>
-        <w:t>Path: /</w:t>
-      </w:r>
-      <w:proofErr w:type="spellStart"/>
-      <w:r>
-        <w:rPr>
-          <w:lang w:val="fr-CA"/>
-        </w:rPr>
-        <w:t>query</w:t>
-      </w:r>
-      <w:proofErr w:type="spellEnd"/>
-    </w:p>
-    <w:p>
-      <w:pPr>
-        <w:pStyle w:val="Paragraphedeliste"/>
-        <w:numPr>
-          <w:ilvl w:val="0"/>
-          <w:numId w:val="15"/>
-        </w:numPr>
-        <w:rPr>
-          <w:lang w:val="fr-CA"/>
-        </w:rPr>
-      </w:pPr>
-      <w:r>
-        <w:rPr>
-          <w:lang w:val="fr-CA"/>
-        </w:rPr>
-        <w:t>Headers: Content-Type: application/</w:t>
-      </w:r>
-      <w:proofErr w:type="spellStart"/>
-      <w:r>
-        <w:rPr>
-          <w:lang w:val="fr-CA"/>
-        </w:rPr>
-        <w:t>json</w:t>
-      </w:r>
-      <w:proofErr w:type="spellEnd"/>
-      <w:r>
-        <w:rPr>
-          <w:lang w:val="fr-CA"/>
-        </w:rPr>
-        <w:t xml:space="preserve">, X-Client-Key (optionnel selon votre </w:t>
-      </w:r>
-      <w:proofErr w:type="spellStart"/>
-      <w:r>
-        <w:rPr>
-          <w:lang w:val="fr-CA"/>
-        </w:rPr>
-        <w:t>policy</w:t>
-      </w:r>
-      <w:proofErr w:type="spellEnd"/>
-      <w:r>
-        <w:rPr>
-          <w:lang w:val="fr-CA"/>
-        </w:rPr>
-        <w:t>)</w:t>
-      </w:r>
-    </w:p>
-    <w:p>
-      <w:pPr>
-        <w:pStyle w:val="Paragraphedeliste"/>
-        <w:numPr>
-          <w:ilvl w:val="0"/>
-          <w:numId w:val="15"/>
-        </w:numPr>
-        <w:rPr>
-          <w:lang w:val="fr-CA"/>
-        </w:rPr>
-      </w:pPr>
-      <w:r>
-        <w:rPr>
-          <w:lang w:val="fr-CA"/>
-        </w:rPr>
-        <w:t xml:space="preserve">Body JSON minimal: </w:t>
-      </w:r>
-      <w:proofErr w:type="gramStart"/>
-      <w:r>
-        <w:rPr>
-          <w:lang w:val="fr-CA"/>
-        </w:rPr>
-        <w:t>{ "</w:t>
-      </w:r>
-      <w:proofErr w:type="gramEnd"/>
-      <w:r>
-        <w:rPr>
-          <w:lang w:val="fr-CA"/>
-        </w:rPr>
-        <w:t>question": "...", "</w:t>
-      </w:r>
-      <w:proofErr w:type="spellStart"/>
-      <w:r>
-        <w:rPr>
-          <w:lang w:val="fr-CA"/>
-        </w:rPr>
-        <w:t>language</w:t>
-      </w:r>
-      <w:proofErr w:type="spellEnd"/>
-      <w:r>
-        <w:rPr>
-          <w:lang w:val="fr-CA"/>
-        </w:rPr>
-        <w:t>": "</w:t>
-      </w:r>
-      <w:proofErr w:type="spellStart"/>
-      <w:r>
-        <w:rPr>
-          <w:lang w:val="fr-CA"/>
-        </w:rPr>
-        <w:t>fr</w:t>
-      </w:r>
-      <w:proofErr w:type="spellEnd"/>
-      <w:proofErr w:type="gramStart"/>
-      <w:r>
-        <w:rPr>
-          <w:lang w:val="fr-CA"/>
-        </w:rPr>
-        <w:t>" }</w:t>
-      </w:r>
-      <w:proofErr w:type="gramEnd"/>
-    </w:p>
-    <w:p>
-      <w:pPr>
-        <w:rPr>
-          <w:lang w:val="fr-CA"/>
-        </w:rPr>
-      </w:pPr>
-      <w:proofErr w:type="spellStart"/>
-      <w:r>
-        <w:rPr>
-          <w:lang w:val="fr-CA"/>
-        </w:rPr>
-        <w:t>Response</w:t>
-      </w:r>
-      <w:proofErr w:type="spellEnd"/>
-      <w:r>
-        <w:rPr>
-          <w:lang w:val="fr-CA"/>
-        </w:rPr>
-        <w:t>:</w:t>
       </w:r>
     </w:p>
     <w:p>
@@ -1138,31 +573,8 @@
         <w:rPr>
           <w:lang w:val="fr-CA"/>
         </w:rPr>
-        <w:lastRenderedPageBreak/>
-        <w:t xml:space="preserve">Content-Type: </w:t>
-      </w:r>
-      <w:proofErr w:type="spellStart"/>
-      <w:r>
-        <w:rPr>
-          <w:lang w:val="fr-CA"/>
-        </w:rPr>
-        <w:t>text</w:t>
-      </w:r>
-      <w:proofErr w:type="spellEnd"/>
-      <w:r>
-        <w:rPr>
-          <w:lang w:val="fr-CA"/>
-        </w:rPr>
-        <w:t>/</w:t>
-      </w:r>
-      <w:proofErr w:type="spellStart"/>
-      <w:r>
-        <w:rPr>
-          <w:lang w:val="fr-CA"/>
-        </w:rPr>
-        <w:t>event-stream</w:t>
-      </w:r>
-      <w:proofErr w:type="spellEnd"/>
+        <w:t>POST /query</w:t>
+      </w:r>
     </w:p>
     <w:p>
       <w:pPr>
@@ -1179,27 +591,803 @@
         <w:rPr>
           <w:lang w:val="fr-CA"/>
         </w:rPr>
-        <w:t>Évé</w:t>
-      </w:r>
-      <w:r>
-        <w:rPr>
-          <w:lang w:val="fr-CA"/>
-        </w:rPr>
-        <w:t>nements avec data: {"</w:t>
-      </w:r>
-      <w:proofErr w:type="spellStart"/>
-      <w:r>
-        <w:rPr>
-          <w:lang w:val="fr-CA"/>
-        </w:rPr>
-        <w:t>chunk</w:t>
-      </w:r>
-      <w:proofErr w:type="spellEnd"/>
-      <w:r>
-        <w:rPr>
-          <w:lang w:val="fr-CA"/>
-        </w:rPr>
-        <w:t>": "..."} puis data: [DONE]</w:t>
+        <w:t>Headers</w:t>
+      </w:r>
+    </w:p>
+    <w:p>
+      <w:pPr>
+        <w:pStyle w:val="Paragraphedeliste"/>
+        <w:numPr>
+          <w:ilvl w:val="1"/>
+          <w:numId w:val="18"/>
+        </w:numPr>
+        <w:rPr>
+          <w:lang w:val="fr-CA"/>
+        </w:rPr>
+      </w:pPr>
+      <w:r>
+        <w:rPr>
+          <w:lang w:val="fr-CA"/>
+        </w:rPr>
+        <w:t>X-Client-Key: &lt;clé&gt; si l’accès par clé est utilisé</w:t>
+      </w:r>
+    </w:p>
+    <w:p>
+      <w:pPr>
+        <w:pStyle w:val="Paragraphedeliste"/>
+        <w:numPr>
+          <w:ilvl w:val="1"/>
+          <w:numId w:val="18"/>
+        </w:numPr>
+        <w:rPr>
+          <w:lang w:val="fr-CA"/>
+        </w:rPr>
+      </w:pPr>
+      <w:r>
+        <w:rPr>
+          <w:lang w:val="fr-CA"/>
+        </w:rPr>
+        <w:t>Content-Type: application/json</w:t>
+      </w:r>
+    </w:p>
+    <w:p>
+      <w:pPr>
+        <w:pStyle w:val="Paragraphedeliste"/>
+        <w:numPr>
+          <w:ilvl w:val="0"/>
+          <w:numId w:val="18"/>
+        </w:numPr>
+        <w:rPr>
+          <w:lang w:val="fr-CA"/>
+        </w:rPr>
+      </w:pPr>
+      <w:r>
+        <w:rPr>
+          <w:lang w:val="fr-CA"/>
+        </w:rPr>
+        <w:t>Body</w:t>
+      </w:r>
+    </w:p>
+    <w:p>
+      <w:pPr>
+        <w:pStyle w:val="Paragraphedeliste"/>
+        <w:numPr>
+          <w:ilvl w:val="1"/>
+          <w:numId w:val="18"/>
+        </w:numPr>
+        <w:rPr>
+          <w:lang w:val="fr-CA"/>
+        </w:rPr>
+      </w:pPr>
+      <w:r>
+        <w:rPr>
+          <w:lang w:val="fr-CA"/>
+        </w:rPr>
+        <w:t>question: texte de la question</w:t>
+      </w:r>
+    </w:p>
+    <w:p>
+      <w:pPr>
+        <w:pStyle w:val="Paragraphedeliste"/>
+        <w:numPr>
+          <w:ilvl w:val="1"/>
+          <w:numId w:val="18"/>
+        </w:numPr>
+        <w:rPr>
+          <w:lang w:val="fr-CA"/>
+        </w:rPr>
+      </w:pPr>
+      <w:r>
+        <w:rPr>
+          <w:lang w:val="fr-CA"/>
+        </w:rPr>
+        <w:t>language: langue optionnelle, par exemple fr</w:t>
+      </w:r>
+    </w:p>
+    <w:p>
+      <w:pPr>
+        <w:pStyle w:val="Paragraphedeliste"/>
+        <w:numPr>
+          <w:ilvl w:val="0"/>
+          <w:numId w:val="18"/>
+        </w:numPr>
+        <w:rPr>
+          <w:lang w:val="fr-CA"/>
+        </w:rPr>
+      </w:pPr>
+      <w:r>
+        <w:rPr>
+          <w:lang w:val="fr-CA"/>
+        </w:rPr>
+        <w:t>Exemple :</w:t>
+      </w:r>
+    </w:p>
+    <w:p>
+      <w:pPr>
+        <w:spacing w:after="0" w:line="240" w:lineRule="auto"/>
+        <w:ind w:left="1077"/>
+        <w:rPr>
+          <w:lang w:val="fr-CA"/>
+        </w:rPr>
+      </w:pPr>
+      <w:r>
+        <w:rPr>
+          <w:lang w:val="fr-CA"/>
+        </w:rPr>
+        <w:t>{</w:t>
+      </w:r>
+    </w:p>
+    <w:p>
+      <w:pPr>
+        <w:spacing w:after="0" w:line="240" w:lineRule="auto"/>
+        <w:ind w:left="1077"/>
+        <w:rPr>
+          <w:lang w:val="fr-CA"/>
+        </w:rPr>
+      </w:pPr>
+      <w:r>
+        <w:rPr>
+          <w:lang w:val="fr-CA"/>
+        </w:rPr>
+        <w:t>  "question": "Quels sont les aliments riches en fibres ?",</w:t>
+      </w:r>
+    </w:p>
+    <w:p>
+      <w:pPr>
+        <w:spacing w:after="0" w:line="240" w:lineRule="auto"/>
+        <w:ind w:left="1077"/>
+        <w:rPr>
+          <w:lang w:val="fr-CA"/>
+        </w:rPr>
+      </w:pPr>
+      <w:r>
+        <w:rPr>
+          <w:lang w:val="fr-CA"/>
+        </w:rPr>
+        <w:lastRenderedPageBreak/>
+        <w:t>  "language": "fr"</w:t>
+      </w:r>
+    </w:p>
+    <w:p>
+      <w:pPr>
+        <w:spacing w:after="0" w:line="240" w:lineRule="auto"/>
+        <w:ind w:left="1077"/>
+        <w:rPr>
+          <w:lang w:val="fr-CA"/>
+        </w:rPr>
+      </w:pPr>
+      <w:r>
+        <w:rPr>
+          <w:lang w:val="fr-CA"/>
+        </w:rPr>
+        <w:t>}</w:t>
+      </w:r>
+    </w:p>
+    <w:p>
+      <w:pPr>
+        <w:ind w:left="360"/>
+        <w:rPr>
+          <w:b/>
+          <w:bCs/>
+          <w:lang w:val="fr-CA"/>
+        </w:rPr>
+      </w:pPr>
+      <w:r>
+        <w:rPr>
+          <w:b/>
+          <w:bCs/>
+          <w:lang w:val="fr-CA"/>
+        </w:rPr>
+        <w:t>Response</w:t>
+      </w:r>
+    </w:p>
+    <w:p>
+      <w:pPr>
+        <w:pStyle w:val="Paragraphedeliste"/>
+        <w:numPr>
+          <w:ilvl w:val="1"/>
+          <w:numId w:val="18"/>
+        </w:numPr>
+        <w:rPr>
+          <w:lang w:val="fr-CA"/>
+        </w:rPr>
+      </w:pPr>
+      <w:r>
+        <w:rPr>
+          <w:lang w:val="fr-CA"/>
+        </w:rPr>
+        <w:t>200 OK</w:t>
+      </w:r>
+    </w:p>
+    <w:p>
+      <w:pPr>
+        <w:pStyle w:val="Paragraphedeliste"/>
+        <w:numPr>
+          <w:ilvl w:val="1"/>
+          <w:numId w:val="18"/>
+        </w:numPr>
+        <w:rPr>
+          <w:lang w:val="fr-CA"/>
+        </w:rPr>
+      </w:pPr>
+      <w:r>
+        <w:rPr>
+          <w:lang w:val="fr-CA"/>
+        </w:rPr>
+        <w:t>Content-Type: text/event-stream</w:t>
+      </w:r>
+    </w:p>
+    <w:p>
+      <w:pPr>
+        <w:pStyle w:val="Paragraphedeliste"/>
+        <w:numPr>
+          <w:ilvl w:val="1"/>
+          <w:numId w:val="18"/>
+        </w:numPr>
+        <w:rPr>
+          <w:lang w:val="fr-CA"/>
+        </w:rPr>
+      </w:pPr>
+      <w:r>
+        <w:rPr>
+          <w:lang w:val="fr-CA"/>
+        </w:rPr>
+        <w:t>Réponse en flux SSE avec plusieurs événements data:</w:t>
+      </w:r>
+    </w:p>
+    <w:p>
+      <w:pPr>
+        <w:pStyle w:val="Paragraphedeliste"/>
+        <w:numPr>
+          <w:ilvl w:val="1"/>
+          <w:numId w:val="18"/>
+        </w:numPr>
+        <w:rPr>
+          <w:lang w:val="fr-CA"/>
+        </w:rPr>
+      </w:pPr>
+      <w:r>
+        <w:rPr>
+          <w:lang w:val="fr-CA"/>
+        </w:rPr>
+        <w:t>Chaque chunk contient en général :</w:t>
+      </w:r>
+    </w:p>
+    <w:p>
+      <w:pPr>
+        <w:pStyle w:val="Paragraphedeliste"/>
+        <w:numPr>
+          <w:ilvl w:val="2"/>
+          <w:numId w:val="18"/>
+        </w:numPr>
+        <w:rPr>
+          <w:lang w:val="fr-CA"/>
+        </w:rPr>
+      </w:pPr>
+      <w:r>
+        <w:rPr>
+          <w:lang w:val="fr-CA"/>
+        </w:rPr>
+        <w:t>{"chunk":"..."}</w:t>
+      </w:r>
+    </w:p>
+    <w:p>
+      <w:pPr>
+        <w:pStyle w:val="Paragraphedeliste"/>
+        <w:numPr>
+          <w:ilvl w:val="1"/>
+          <w:numId w:val="18"/>
+        </w:numPr>
+        <w:rPr>
+          <w:lang w:val="fr-CA"/>
+        </w:rPr>
+      </w:pPr>
+      <w:r>
+        <w:rPr>
+          <w:lang w:val="fr-CA"/>
+        </w:rPr>
+        <w:t>Fin de réponse :</w:t>
+      </w:r>
+    </w:p>
+    <w:p>
+      <w:pPr>
+        <w:pStyle w:val="Paragraphedeliste"/>
+        <w:numPr>
+          <w:ilvl w:val="2"/>
+          <w:numId w:val="18"/>
+        </w:numPr>
+        <w:rPr>
+          <w:lang w:val="fr-CA"/>
+        </w:rPr>
+      </w:pPr>
+      <w:r>
+        <w:rPr>
+          <w:lang w:val="fr-CA"/>
+        </w:rPr>
+        <w:t>data: [DONE]</w:t>
+      </w:r>
+    </w:p>
+    <w:p>
+      <w:pPr>
+        <w:ind w:left="360"/>
+        <w:rPr>
+          <w:b/>
+          <w:bCs/>
+          <w:lang w:val="fr-CA"/>
+        </w:rPr>
+      </w:pPr>
+      <w:r>
+        <w:rPr>
+          <w:b/>
+          <w:bCs/>
+          <w:lang w:val="fr-CA"/>
+        </w:rPr>
+        <w:t>Erreurs possibles</w:t>
+      </w:r>
+    </w:p>
+    <w:p>
+      <w:pPr>
+        <w:pStyle w:val="Paragraphedeliste"/>
+        <w:numPr>
+          <w:ilvl w:val="1"/>
+          <w:numId w:val="18"/>
+        </w:numPr>
+        <w:rPr>
+          <w:lang w:val="fr-CA"/>
+        </w:rPr>
+      </w:pPr>
+      <w:r>
+        <w:rPr>
+          <w:lang w:val="fr-CA"/>
+        </w:rPr>
+        <w:t>401 Unauthorized si la clé est absente ou invalide</w:t>
+      </w:r>
+    </w:p>
+    <w:p>
+      <w:pPr>
+        <w:pStyle w:val="Paragraphedeliste"/>
+        <w:numPr>
+          <w:ilvl w:val="1"/>
+          <w:numId w:val="18"/>
+        </w:numPr>
+        <w:rPr>
+          <w:lang w:val="fr-CA"/>
+        </w:rPr>
+      </w:pPr>
+      <w:r>
+        <w:rPr>
+          <w:lang w:val="fr-CA"/>
+        </w:rPr>
+        <w:t>403 Forbidden si le rôle utilisateur est insuffisant</w:t>
+      </w:r>
+    </w:p>
+    <w:p>
+      <w:pPr>
+        <w:pStyle w:val="Paragraphedeliste"/>
+        <w:numPr>
+          <w:ilvl w:val="1"/>
+          <w:numId w:val="18"/>
+        </w:numPr>
+        <w:rPr>
+          <w:lang w:val="fr-CA"/>
+        </w:rPr>
+      </w:pPr>
+      <w:r>
+        <w:rPr>
+          <w:lang w:val="fr-CA"/>
+        </w:rPr>
+        <w:t>400 Bad Request si la requête est invalide</w:t>
+      </w:r>
+    </w:p>
+    <w:p>
+      <w:pPr>
+        <w:pStyle w:val="Paragraphedeliste"/>
+        <w:numPr>
+          <w:ilvl w:val="1"/>
+          <w:numId w:val="18"/>
+        </w:numPr>
+        <w:rPr>
+          <w:lang w:val="fr-CA"/>
+        </w:rPr>
+      </w:pPr>
+      <w:r>
+        <w:rPr>
+          <w:lang w:val="fr-CA"/>
+        </w:rPr>
+        <w:t>500 Internal Server Error en cas d’erreur serveur</w:t>
+      </w:r>
+    </w:p>
+    <w:p>
+      <w:pPr>
+        <w:pStyle w:val="Titre1"/>
+        <w:shd w:val="clear" w:color="auto" w:fill="C1E4F5" w:themeFill="accent1" w:themeFillTint="33"/>
+        <w:rPr>
+          <w:lang w:val="fr-CA"/>
+        </w:rPr>
+      </w:pPr>
+      <w:r>
+        <w:rPr>
+          <w:lang w:val="fr-CA"/>
+        </w:rPr>
+        <w:t>/download_page</w:t>
+      </w:r>
+    </w:p>
+    <w:p>
+      <w:pPr>
+        <w:ind w:left="360"/>
+        <w:rPr>
+          <w:lang w:val="fr-CA"/>
+        </w:rPr>
+      </w:pPr>
+      <w:r>
+        <w:rPr>
+          <w:b/>
+          <w:bCs/>
+          <w:lang w:val="fr-CA"/>
+        </w:rPr>
+        <w:t>Request</w:t>
+      </w:r>
+    </w:p>
+    <w:p>
+      <w:pPr>
+        <w:pStyle w:val="Paragraphedeliste"/>
+        <w:numPr>
+          <w:ilvl w:val="0"/>
+          <w:numId w:val="18"/>
+        </w:numPr>
+        <w:rPr>
+          <w:lang w:val="fr-CA"/>
+        </w:rPr>
+      </w:pPr>
+      <w:r>
+        <w:rPr>
+          <w:lang w:val="fr-CA"/>
+        </w:rPr>
+        <w:t>POST /download_page</w:t>
+      </w:r>
+    </w:p>
+    <w:p>
+      <w:pPr>
+        <w:pStyle w:val="Paragraphedeliste"/>
+        <w:numPr>
+          <w:ilvl w:val="0"/>
+          <w:numId w:val="18"/>
+        </w:numPr>
+        <w:rPr>
+          <w:lang w:val="fr-CA"/>
+        </w:rPr>
+      </w:pPr>
+      <w:r>
+        <w:rPr>
+          <w:lang w:val="fr-CA"/>
+        </w:rPr>
+        <w:t>Headers</w:t>
+      </w:r>
+    </w:p>
+    <w:p>
+      <w:pPr>
+        <w:pStyle w:val="Paragraphedeliste"/>
+        <w:numPr>
+          <w:ilvl w:val="1"/>
+          <w:numId w:val="18"/>
+        </w:numPr>
+        <w:rPr>
+          <w:lang w:val="fr-CA"/>
+        </w:rPr>
+      </w:pPr>
+      <w:r>
+        <w:rPr>
+          <w:lang w:val="fr-CA"/>
+        </w:rPr>
+        <w:t>X-Client-Key: &lt;clé&gt;</w:t>
+      </w:r>
+    </w:p>
+    <w:p>
+      <w:pPr>
+        <w:pStyle w:val="Paragraphedeliste"/>
+        <w:numPr>
+          <w:ilvl w:val="0"/>
+          <w:numId w:val="18"/>
+        </w:numPr>
+        <w:rPr>
+          <w:lang w:val="fr-CA"/>
+        </w:rPr>
+      </w:pPr>
+      <w:r>
+        <w:rPr>
+          <w:lang w:val="fr-CA"/>
+        </w:rPr>
+        <w:t>Content-Type</w:t>
+      </w:r>
+    </w:p>
+    <w:p>
+      <w:pPr>
+        <w:pStyle w:val="Paragraphedeliste"/>
+        <w:numPr>
+          <w:ilvl w:val="1"/>
+          <w:numId w:val="18"/>
+        </w:numPr>
+        <w:rPr>
+          <w:lang w:val="fr-CA"/>
+        </w:rPr>
+      </w:pPr>
+      <w:r>
+        <w:rPr>
+          <w:lang w:val="fr-CA"/>
+        </w:rPr>
+        <w:t>multipart/form-data</w:t>
+      </w:r>
+    </w:p>
+    <w:p>
+      <w:pPr>
+        <w:pStyle w:val="Paragraphedeliste"/>
+        <w:numPr>
+          <w:ilvl w:val="0"/>
+          <w:numId w:val="18"/>
+        </w:numPr>
+        <w:rPr>
+          <w:lang w:val="fr-CA"/>
+        </w:rPr>
+      </w:pPr>
+      <w:r>
+        <w:rPr>
+          <w:lang w:val="fr-CA"/>
+        </w:rPr>
+        <w:t>Body</w:t>
+      </w:r>
+    </w:p>
+    <w:p>
+      <w:pPr>
+        <w:pStyle w:val="Paragraphedeliste"/>
+        <w:numPr>
+          <w:ilvl w:val="1"/>
+          <w:numId w:val="18"/>
+        </w:numPr>
+        <w:rPr>
+          <w:lang w:val="fr-CA"/>
+        </w:rPr>
+      </w:pPr>
+      <w:r>
+        <w:rPr>
+          <w:lang w:val="fr-CA"/>
+        </w:rPr>
+        <w:t>file: le fichier à transférer</w:t>
+      </w:r>
+    </w:p>
+    <w:p>
+      <w:pPr>
+        <w:pStyle w:val="Paragraphedeliste"/>
+        <w:numPr>
+          <w:ilvl w:val="0"/>
+          <w:numId w:val="18"/>
+        </w:numPr>
+        <w:rPr>
+          <w:lang w:val="fr-CA"/>
+        </w:rPr>
+      </w:pPr>
+      <w:r>
+        <w:rPr>
+          <w:lang w:val="fr-CA"/>
+        </w:rPr>
+        <w:t>Le fichier est envoyé tel quel, sans conversion, et son nom d’origine est conservé côté stockage.</w:t>
+      </w:r>
+    </w:p>
+    <w:p>
+      <w:pPr>
+        <w:ind w:left="360"/>
+        <w:rPr>
+          <w:lang w:val="fr-CA"/>
+        </w:rPr>
+      </w:pPr>
+      <w:r>
+        <w:rPr>
+          <w:b/>
+          <w:bCs/>
+          <w:lang w:val="fr-CA"/>
+        </w:rPr>
+        <w:t>Response</w:t>
+      </w:r>
+    </w:p>
+    <w:p>
+      <w:pPr>
+        <w:pStyle w:val="Paragraphedeliste"/>
+        <w:numPr>
+          <w:ilvl w:val="0"/>
+          <w:numId w:val="18"/>
+        </w:numPr>
+        <w:rPr>
+          <w:lang w:val="fr-CA"/>
+        </w:rPr>
+      </w:pPr>
+      <w:r>
+        <w:rPr>
+          <w:lang w:val="fr-CA"/>
+        </w:rPr>
+        <w:t>200 OK</w:t>
+      </w:r>
+    </w:p>
+    <w:p>
+      <w:pPr>
+        <w:pStyle w:val="Paragraphedeliste"/>
+        <w:numPr>
+          <w:ilvl w:val="0"/>
+          <w:numId w:val="18"/>
+        </w:numPr>
+        <w:rPr>
+          <w:lang w:val="fr-CA"/>
+        </w:rPr>
+      </w:pPr>
+      <w:r>
+        <w:rPr>
+          <w:lang w:val="fr-CA"/>
+        </w:rPr>
+        <w:t>Content-Type: application/json</w:t>
+      </w:r>
+    </w:p>
+    <w:p>
+      <w:pPr>
+        <w:pStyle w:val="Paragraphedeliste"/>
+        <w:numPr>
+          <w:ilvl w:val="0"/>
+          <w:numId w:val="18"/>
+        </w:numPr>
+        <w:rPr>
+          <w:lang w:val="fr-CA"/>
+        </w:rPr>
+      </w:pPr>
+      <w:r>
+        <w:rPr>
+          <w:lang w:val="fr-CA"/>
+        </w:rPr>
+        <w:t>Exemple :</w:t>
+      </w:r>
+    </w:p>
+    <w:p>
+      <w:pPr>
+        <w:spacing w:after="0"/>
+        <w:ind w:left="1077"/>
+        <w:rPr>
+          <w:lang w:val="fr-CA"/>
+        </w:rPr>
+      </w:pPr>
+      <w:r>
+        <w:rPr>
+          <w:lang w:val="fr-CA"/>
+        </w:rPr>
+        <w:t>{</w:t>
+      </w:r>
+    </w:p>
+    <w:p>
+      <w:pPr>
+        <w:spacing w:after="0"/>
+        <w:ind w:left="1077"/>
+        <w:rPr>
+          <w:lang w:val="fr-CA"/>
+        </w:rPr>
+      </w:pPr>
+      <w:r>
+        <w:rPr>
+          <w:lang w:val="fr-CA"/>
+        </w:rPr>
+        <w:t>  "status": "saved",</w:t>
+      </w:r>
+    </w:p>
+    <w:p>
+      <w:pPr>
+        <w:spacing w:after="0"/>
+        <w:ind w:left="1077"/>
+        <w:rPr>
+          <w:lang w:val="fr-CA"/>
+        </w:rPr>
+      </w:pPr>
+      <w:r>
+        <w:rPr>
+          <w:lang w:val="fr-CA"/>
+        </w:rPr>
+        <w:t>  "filename": "mon-fichier.pdf",</w:t>
+      </w:r>
+    </w:p>
+    <w:p>
+      <w:pPr>
+        <w:spacing w:after="0"/>
+        <w:ind w:left="1077"/>
+        <w:rPr>
+          <w:lang w:val="fr-CA"/>
+        </w:rPr>
+      </w:pPr>
+      <w:r>
+        <w:rPr>
+          <w:lang w:val="fr-CA"/>
+        </w:rPr>
+        <w:t>  "path": "nutrifaq-dbase-main/documents/mon-fichier.pdf"</w:t>
+      </w:r>
+    </w:p>
+    <w:p>
+      <w:pPr>
+        <w:spacing w:after="0"/>
+        <w:ind w:left="1077"/>
+        <w:rPr>
+          <w:lang w:val="fr-CA"/>
+        </w:rPr>
+      </w:pPr>
+      <w:r>
+        <w:rPr>
+          <w:lang w:val="fr-CA"/>
+        </w:rPr>
+        <w:t>}</w:t>
+      </w:r>
+    </w:p>
+    <w:p>
+      <w:pPr>
+        <w:ind w:left="360"/>
+        <w:rPr>
+          <w:b/>
+          <w:bCs/>
+          <w:lang w:val="fr-CA"/>
+        </w:rPr>
+      </w:pPr>
+      <w:r>
+        <w:rPr>
+          <w:b/>
+          <w:bCs/>
+          <w:lang w:val="fr-CA"/>
+        </w:rPr>
+        <w:lastRenderedPageBreak/>
+        <w:t>Erreurs possibles</w:t>
+      </w:r>
+    </w:p>
+    <w:p>
+      <w:pPr>
+        <w:pStyle w:val="Paragraphedeliste"/>
+        <w:numPr>
+          <w:ilvl w:val="1"/>
+          <w:numId w:val="18"/>
+        </w:numPr>
+        <w:rPr>
+          <w:lang w:val="fr-CA"/>
+        </w:rPr>
+      </w:pPr>
+      <w:r>
+        <w:rPr>
+          <w:lang w:val="fr-CA"/>
+        </w:rPr>
+        <w:t>400 Bad Request si le fichier est manquant ou vide</w:t>
+      </w:r>
+    </w:p>
+    <w:p>
+      <w:pPr>
+        <w:pStyle w:val="Paragraphedeliste"/>
+        <w:numPr>
+          <w:ilvl w:val="1"/>
+          <w:numId w:val="18"/>
+        </w:numPr>
+        <w:rPr>
+          <w:lang w:val="fr-CA"/>
+        </w:rPr>
+      </w:pPr>
+      <w:r>
+        <w:rPr>
+          <w:lang w:val="fr-CA"/>
+        </w:rPr>
+        <w:t>401 Unauthorized si X-Client-Key est absent ou invalide</w:t>
+      </w:r>
+    </w:p>
+    <w:p>
+      <w:pPr>
+        <w:pStyle w:val="Paragraphedeliste"/>
+        <w:numPr>
+          <w:ilvl w:val="1"/>
+          <w:numId w:val="18"/>
+        </w:numPr>
+        <w:rPr>
+          <w:lang w:val="fr-CA"/>
+        </w:rPr>
+      </w:pPr>
+      <w:r>
+        <w:rPr>
+          <w:lang w:val="fr-CA"/>
+        </w:rPr>
+        <w:t>500 Internal Server Error si la clé serveur n’est pas configurée ou si la sauvegarde échoue</w:t>
       </w:r>
     </w:p>
     <w:p>
@@ -1267,21 +1455,7 @@
         <w:rPr>
           <w:lang w:val="fr-CA"/>
         </w:rPr>
-        <w:t xml:space="preserve"> </w:t>
-      </w:r>
-      <w:proofErr w:type="spellStart"/>
-      <w:r>
-        <w:rPr>
-          <w:lang w:val="fr-CA"/>
-        </w:rPr>
-        <w:t>query</w:t>
-      </w:r>
-      <w:proofErr w:type="spellEnd"/>
-      <w:r>
-        <w:rPr>
-          <w:lang w:val="fr-CA"/>
-        </w:rPr>
-        <w:t xml:space="preserve"> et la config backend QUERY_ACCESS_KEY.</w:t>
+        <w:t xml:space="preserve"> query et la config backend QUERY_ACCESS_KEY.</w:t>
       </w:r>
     </w:p>
     <w:p>
@@ -1353,21 +1527,7 @@
         <w:rPr>
           <w:lang w:val="fr-CA"/>
         </w:rPr>
-        <w:t xml:space="preserve">origine frontend dans la config </w:t>
-      </w:r>
-      <w:proofErr w:type="spellStart"/>
-      <w:r>
-        <w:rPr>
-          <w:lang w:val="fr-CA"/>
-        </w:rPr>
-        <w:t>FastAPI</w:t>
-      </w:r>
-      <w:proofErr w:type="spellEnd"/>
-      <w:r>
-        <w:rPr>
-          <w:lang w:val="fr-CA"/>
-        </w:rPr>
-        <w:t>.</w:t>
+        <w:t>origine frontend dans la config FastAPI.</w:t>
       </w:r>
     </w:p>
     <w:p>
@@ -1413,6 +1573,8 @@
       </w:r>
     </w:p>
     <w:sectPr>
+      <w:headerReference w:type="default" r:id="rId7"/>
+      <w:footerReference w:type="default" r:id="rId8"/>
       <w:pgSz w:w="11906" w:h="16838"/>
       <w:pgMar w:top="1440" w:right="1440" w:bottom="1440" w:left="1440" w:header="708" w:footer="708" w:gutter="0"/>
       <w:cols w:space="708"/>
@@ -1447,6 +1609,58 @@
 </w:endnotes>
 </file>
 
+<file path=word/footer1.xml><?xml version="1.0" encoding="utf-8"?>
+<w:ftr xmlns:wpc="http://schemas.microsoft.com/office/word/2010/wordprocessingCanvas" xmlns:cx="http://schemas.microsoft.com/office/drawing/2014/chartex" xmlns:cx1="http://schemas.microsoft.com/office/drawing/2015/9/8/chartex" xmlns:cx2="http://schemas.microsoft.com/office/drawing/2015/10/21/chartex" xmlns:cx3="http://schemas.microsoft.com/office/drawing/2016/5/9/chartex" xmlns:cx4="http://schemas.microsoft.com/office/drawing/2016/5/10/chartex" xmlns:cx5="http://schemas.microsoft.com/office/drawing/2016/5/11/chartex" xmlns:cx6="http://schemas.microsoft.com/office/drawing/2016/5/12/chartex" xmlns:cx7="http://schemas.microsoft.com/office/drawing/2016/5/13/chartex" xmlns:cx8="http://schemas.microsoft.com/office/drawing/2016/5/14/chartex" xmlns:mc="http://schemas.openxmlformats.org/markup-compatibility/2006" xmlns:aink="http://schemas.microsoft.com/office/drawing/2016/ink" xmlns:am3d="http://schemas.microsoft.com/office/drawing/2017/model3d" xmlns:o="urn:schemas-microsoft-com:office:office" xmlns:oel="http://schemas.microsoft.com/office/2019/extlst" xmlns:r="http://schemas.openxmlformats.org/officeDocument/2006/relationships" xmlns:m="http://schemas.openxmlformats.org/officeDocument/2006/math" xmlns:v="urn:schemas-microsoft-com:vml" xmlns:wp14="http://schemas.microsoft.com/office/word/2010/wordprocessingDrawing" xmlns:wp="http://schemas.openxmlformats.org/drawingml/2006/wordprocessingDrawing" xmlns:w10="urn:schemas-microsoft-com:office:word" xmlns:w="http://schemas.openxmlformats.org/wordprocessingml/2006/main" xmlns:w14="http://schemas.microsoft.com/office/word/2010/wordml" xmlns:w15="http://schemas.microsoft.com/office/word/2012/wordml" xmlns:w16cex="http://schemas.microsoft.com/office/word/2018/wordml/cex" xmlns:w16cid="http://schemas.microsoft.com/office/word/2016/wordml/cid" xmlns:w16="http://schemas.microsoft.com/office/word/2018/wordml" xmlns:w16du="http://schemas.microsoft.com/office/word/2023/wordml/word16du" xmlns:w16sdtdh="http://schemas.microsoft.com/office/word/2020/wordml/sdtdatahash" xmlns:w16sdtfl="http://schemas.microsoft.com/office/word/2024/wordml/sdtformatlock" xmlns:w16se="http://schemas.microsoft.com/office/word/2015/wordml/symex" xmlns:wpg="http://schemas.microsoft.com/office/word/2010/wordprocessingGroup" xmlns:wpi="http://schemas.microsoft.com/office/word/2010/wordprocessingInk" xmlns:wne="http://schemas.microsoft.com/office/word/2006/wordml" xmlns:wps="http://schemas.microsoft.com/office/word/2010/wordprocessingShape" mc:Ignorable="w14 w15 w16se w16cid w16 w16cex w16sdtdh w16sdtfl w16du wp14">
+  <w:p>
+    <w:pPr>
+      <w:pStyle w:val="Pieddepage"/>
+      <w:pBdr>
+        <w:top w:val="single" w:sz="4" w:space="1" w:color="auto"/>
+      </w:pBdr>
+      <w:rPr>
+        <w:lang w:val="fr-CA"/>
+      </w:rPr>
+    </w:pPr>
+    <w:r>
+      <w:rPr>
+        <w:lang w:val="fr-CA"/>
+      </w:rPr>
+      <w:t>Copyright IMX Technologie 2026</w:t>
+    </w:r>
+    <w:r>
+      <w:rPr>
+        <w:lang w:val="fr-CA"/>
+      </w:rPr>
+      <w:t xml:space="preserve"> </w:t>
+    </w:r>
+    <w:r>
+      <w:ptab w:relativeTo="margin" w:alignment="center" w:leader="none"/>
+    </w:r>
+    <w:r>
+      <w:ptab w:relativeTo="margin" w:alignment="right" w:leader="none"/>
+    </w:r>
+    <w:r>
+      <w:fldChar w:fldCharType="begin"/>
+    </w:r>
+    <w:r>
+      <w:instrText>PAGE   \* MERGEFORMAT</w:instrText>
+    </w:r>
+    <w:r>
+      <w:fldChar w:fldCharType="separate"/>
+    </w:r>
+    <w:r>
+      <w:rPr>
+        <w:lang w:val="fr-FR"/>
+      </w:rPr>
+      <w:t>1</w:t>
+    </w:r>
+    <w:r>
+      <w:fldChar w:fldCharType="end"/>
+    </w:r>
+  </w:p>
+</w:ftr>
+</file>
+
 <file path=word/footnotes.xml><?xml version="1.0" encoding="utf-8"?>
 <w:footnotes xmlns:wpc="http://schemas.microsoft.com/office/word/2010/wordprocessingCanvas" xmlns:cx="http://schemas.microsoft.com/office/drawing/2014/chartex" xmlns:cx1="http://schemas.microsoft.com/office/drawing/2015/9/8/chartex" xmlns:cx2="http://schemas.microsoft.com/office/drawing/2015/10/21/chartex" xmlns:cx3="http://schemas.microsoft.com/office/drawing/2016/5/9/chartex" xmlns:cx4="http://schemas.microsoft.com/office/drawing/2016/5/10/chartex" xmlns:cx5="http://schemas.microsoft.com/office/drawing/2016/5/11/chartex" xmlns:cx6="http://schemas.microsoft.com/office/drawing/2016/5/12/chartex" xmlns:cx7="http://schemas.microsoft.com/office/drawing/2016/5/13/chartex" xmlns:cx8="http://schemas.microsoft.com/office/drawing/2016/5/14/chartex" xmlns:mc="http://schemas.openxmlformats.org/markup-compatibility/2006" xmlns:aink="http://schemas.microsoft.com/office/drawing/2016/ink" xmlns:am3d="http://schemas.microsoft.com/office/drawing/2017/model3d" xmlns:o="urn:schemas-microsoft-com:office:office" xmlns:oel="http://schemas.microsoft.com/office/2019/extlst" xmlns:r="http://schemas.openxmlformats.org/officeDocument/2006/relationships" xmlns:m="http://schemas.openxmlformats.org/officeDocument/2006/math" xmlns:v="urn:schemas-microsoft-com:vml" xmlns:wp14="http://schemas.microsoft.com/office/word/2010/wordprocessingDrawing" xmlns:wp="http://schemas.openxmlformats.org/drawingml/2006/wordprocessingDrawing" xmlns:w10="urn:schemas-microsoft-com:office:word" xmlns:w="http://schemas.openxmlformats.org/wordprocessingml/2006/main" xmlns:w14="http://schemas.microsoft.com/office/word/2010/wordml" xmlns:w15="http://schemas.microsoft.com/office/word/2012/wordml" xmlns:w16cex="http://schemas.microsoft.com/office/word/2018/wordml/cex" xmlns:w16cid="http://schemas.microsoft.com/office/word/2016/wordml/cid" xmlns:w16="http://schemas.microsoft.com/office/word/2018/wordml" xmlns:w16du="http://schemas.microsoft.com/office/word/2023/wordml/word16du" xmlns:w16sdtdh="http://schemas.microsoft.com/office/word/2020/wordml/sdtdatahash" xmlns:w16sdtfl="http://schemas.microsoft.com/office/word/2024/wordml/sdtformatlock" xmlns:w16se="http://schemas.microsoft.com/office/word/2015/wordml/symex" xmlns:wpg="http://schemas.microsoft.com/office/word/2010/wordprocessingGroup" xmlns:wpi="http://schemas.microsoft.com/office/word/2010/wordprocessingInk" xmlns:wne="http://schemas.microsoft.com/office/word/2006/wordml" xmlns:wps="http://schemas.microsoft.com/office/word/2010/wordprocessingShape" mc:Ignorable="w14 w15 w16se w16cid w16 w16cex w16sdtdh w16sdtfl w16du wp14">
   <w:footnote w:type="separator" w:id="-1">
@@ -1470,6 +1684,62 @@
     </w:p>
   </w:footnote>
 </w:footnotes>
+</file>
+
+<file path=word/header1.xml><?xml version="1.0" encoding="utf-8"?>
+<w:hdr xmlns:wpc="http://schemas.microsoft.com/office/word/2010/wordprocessingCanvas" xmlns:cx="http://schemas.microsoft.com/office/drawing/2014/chartex" xmlns:cx1="http://schemas.microsoft.com/office/drawing/2015/9/8/chartex" xmlns:cx2="http://schemas.microsoft.com/office/drawing/2015/10/21/chartex" xmlns:cx3="http://schemas.microsoft.com/office/drawing/2016/5/9/chartex" xmlns:cx4="http://schemas.microsoft.com/office/drawing/2016/5/10/chartex" xmlns:cx5="http://schemas.microsoft.com/office/drawing/2016/5/11/chartex" xmlns:cx6="http://schemas.microsoft.com/office/drawing/2016/5/12/chartex" xmlns:cx7="http://schemas.microsoft.com/office/drawing/2016/5/13/chartex" xmlns:cx8="http://schemas.microsoft.com/office/drawing/2016/5/14/chartex" xmlns:mc="http://schemas.openxmlformats.org/markup-compatibility/2006" xmlns:aink="http://schemas.microsoft.com/office/drawing/2016/ink" xmlns:am3d="http://schemas.microsoft.com/office/drawing/2017/model3d" xmlns:o="urn:schemas-microsoft-com:office:office" xmlns:oel="http://schemas.microsoft.com/office/2019/extlst" xmlns:r="http://schemas.openxmlformats.org/officeDocument/2006/relationships" xmlns:m="http://schemas.openxmlformats.org/officeDocument/2006/math" xmlns:v="urn:schemas-microsoft-com:vml" xmlns:wp14="http://schemas.microsoft.com/office/word/2010/wordprocessingDrawing" xmlns:wp="http://schemas.openxmlformats.org/drawingml/2006/wordprocessingDrawing" xmlns:w10="urn:schemas-microsoft-com:office:word" xmlns:w="http://schemas.openxmlformats.org/wordprocessingml/2006/main" xmlns:w14="http://schemas.microsoft.com/office/word/2010/wordml" xmlns:w15="http://schemas.microsoft.com/office/word/2012/wordml" xmlns:w16cex="http://schemas.microsoft.com/office/word/2018/wordml/cex" xmlns:w16cid="http://schemas.microsoft.com/office/word/2016/wordml/cid" xmlns:w16="http://schemas.microsoft.com/office/word/2018/wordml" xmlns:w16du="http://schemas.microsoft.com/office/word/2023/wordml/word16du" xmlns:w16sdtdh="http://schemas.microsoft.com/office/word/2020/wordml/sdtdatahash" xmlns:w16sdtfl="http://schemas.microsoft.com/office/word/2024/wordml/sdtformatlock" xmlns:w16se="http://schemas.microsoft.com/office/word/2015/wordml/symex" xmlns:wpg="http://schemas.microsoft.com/office/word/2010/wordprocessingGroup" xmlns:wpi="http://schemas.microsoft.com/office/word/2010/wordprocessingInk" xmlns:wne="http://schemas.microsoft.com/office/word/2006/wordml" xmlns:wps="http://schemas.microsoft.com/office/word/2010/wordprocessingShape" mc:Ignorable="w14 w15 w16se w16cid w16 w16cex w16sdtdh w16sdtfl w16du wp14">
+  <w:p>
+    <w:pPr>
+      <w:pStyle w:val="En-tte"/>
+    </w:pPr>
+    <w:r>
+      <w:rPr>
+        <w:noProof/>
+      </w:rPr>
+      <w:drawing>
+        <wp:inline distT="0" distB="0" distL="0" distR="0" wp14:anchorId="48367209" wp14:editId="52045EAA">
+          <wp:extent cx="723569" cy="723569"/>
+          <wp:effectExtent l="0" t="0" r="0" b="0"/>
+          <wp:docPr id="2135637785" name="Image 1"/>
+          <wp:cNvGraphicFramePr>
+            <a:graphicFrameLocks xmlns:a="http://schemas.openxmlformats.org/drawingml/2006/main" noChangeAspect="1"/>
+          </wp:cNvGraphicFramePr>
+          <a:graphic xmlns:a="http://schemas.openxmlformats.org/drawingml/2006/main">
+            <a:graphicData uri="http://schemas.openxmlformats.org/drawingml/2006/picture">
+              <pic:pic xmlns:pic="http://schemas.openxmlformats.org/drawingml/2006/picture">
+                <pic:nvPicPr>
+                  <pic:cNvPr id="2135637785" name="Image 2135637785"/>
+                  <pic:cNvPicPr/>
+                </pic:nvPicPr>
+                <pic:blipFill>
+                  <a:blip r:embed="rId1">
+                    <a:extLst>
+                      <a:ext uri="{28A0092B-C50C-407E-A947-70E740481C1C}">
+                        <a14:useLocalDpi xmlns:a14="http://schemas.microsoft.com/office/drawing/2010/main" val="0"/>
+                      </a:ext>
+                    </a:extLst>
+                  </a:blip>
+                  <a:stretch>
+                    <a:fillRect/>
+                  </a:stretch>
+                </pic:blipFill>
+                <pic:spPr>
+                  <a:xfrm>
+                    <a:off x="0" y="0"/>
+                    <a:ext cx="729093" cy="729093"/>
+                  </a:xfrm>
+                  <a:prstGeom prst="rect">
+                    <a:avLst/>
+                  </a:prstGeom>
+                </pic:spPr>
+              </pic:pic>
+            </a:graphicData>
+          </a:graphic>
+        </wp:inline>
+      </w:drawing>
+    </w:r>
+  </w:p>
+</w:hdr>
 </file>
 
 <file path=word/numbering.xml><?xml version="1.0" encoding="utf-8"?>
@@ -1927,6 +2197,304 @@
     </w:lvl>
   </w:abstractNum>
   <w:abstractNum w:abstractNumId="4" w15:restartNumberingAfterBreak="0">
+    <w:nsid w:val="0A8E1745"/>
+    <w:multiLevelType w:val="multilevel"/>
+    <w:tmpl w:val="BED46DD0"/>
+    <w:lvl w:ilvl="0">
+      <w:start w:val="1"/>
+      <w:numFmt w:val="bullet"/>
+      <w:lvlText w:val=""/>
+      <w:lvlJc w:val="left"/>
+      <w:pPr>
+        <w:tabs>
+          <w:tab w:val="num" w:pos="720"/>
+        </w:tabs>
+        <w:ind w:left="720" w:hanging="360"/>
+      </w:pPr>
+      <w:rPr>
+        <w:rFonts w:ascii="Symbol" w:hAnsi="Symbol" w:hint="default"/>
+        <w:sz w:val="20"/>
+      </w:rPr>
+    </w:lvl>
+    <w:lvl w:ilvl="1" w:tentative="1">
+      <w:start w:val="1"/>
+      <w:numFmt w:val="bullet"/>
+      <w:lvlText w:val="o"/>
+      <w:lvlJc w:val="left"/>
+      <w:pPr>
+        <w:tabs>
+          <w:tab w:val="num" w:pos="1440"/>
+        </w:tabs>
+        <w:ind w:left="1440" w:hanging="360"/>
+      </w:pPr>
+      <w:rPr>
+        <w:rFonts w:ascii="Courier New" w:hAnsi="Courier New" w:hint="default"/>
+        <w:sz w:val="20"/>
+      </w:rPr>
+    </w:lvl>
+    <w:lvl w:ilvl="2" w:tentative="1">
+      <w:start w:val="1"/>
+      <w:numFmt w:val="bullet"/>
+      <w:lvlText w:val=""/>
+      <w:lvlJc w:val="left"/>
+      <w:pPr>
+        <w:tabs>
+          <w:tab w:val="num" w:pos="2160"/>
+        </w:tabs>
+        <w:ind w:left="2160" w:hanging="360"/>
+      </w:pPr>
+      <w:rPr>
+        <w:rFonts w:ascii="Wingdings" w:hAnsi="Wingdings" w:hint="default"/>
+        <w:sz w:val="20"/>
+      </w:rPr>
+    </w:lvl>
+    <w:lvl w:ilvl="3" w:tentative="1">
+      <w:start w:val="1"/>
+      <w:numFmt w:val="bullet"/>
+      <w:lvlText w:val=""/>
+      <w:lvlJc w:val="left"/>
+      <w:pPr>
+        <w:tabs>
+          <w:tab w:val="num" w:pos="2880"/>
+        </w:tabs>
+        <w:ind w:left="2880" w:hanging="360"/>
+      </w:pPr>
+      <w:rPr>
+        <w:rFonts w:ascii="Wingdings" w:hAnsi="Wingdings" w:hint="default"/>
+        <w:sz w:val="20"/>
+      </w:rPr>
+    </w:lvl>
+    <w:lvl w:ilvl="4" w:tentative="1">
+      <w:start w:val="1"/>
+      <w:numFmt w:val="bullet"/>
+      <w:lvlText w:val=""/>
+      <w:lvlJc w:val="left"/>
+      <w:pPr>
+        <w:tabs>
+          <w:tab w:val="num" w:pos="3600"/>
+        </w:tabs>
+        <w:ind w:left="3600" w:hanging="360"/>
+      </w:pPr>
+      <w:rPr>
+        <w:rFonts w:ascii="Wingdings" w:hAnsi="Wingdings" w:hint="default"/>
+        <w:sz w:val="20"/>
+      </w:rPr>
+    </w:lvl>
+    <w:lvl w:ilvl="5" w:tentative="1">
+      <w:start w:val="1"/>
+      <w:numFmt w:val="bullet"/>
+      <w:lvlText w:val=""/>
+      <w:lvlJc w:val="left"/>
+      <w:pPr>
+        <w:tabs>
+          <w:tab w:val="num" w:pos="4320"/>
+        </w:tabs>
+        <w:ind w:left="4320" w:hanging="360"/>
+      </w:pPr>
+      <w:rPr>
+        <w:rFonts w:ascii="Wingdings" w:hAnsi="Wingdings" w:hint="default"/>
+        <w:sz w:val="20"/>
+      </w:rPr>
+    </w:lvl>
+    <w:lvl w:ilvl="6" w:tentative="1">
+      <w:start w:val="1"/>
+      <w:numFmt w:val="bullet"/>
+      <w:lvlText w:val=""/>
+      <w:lvlJc w:val="left"/>
+      <w:pPr>
+        <w:tabs>
+          <w:tab w:val="num" w:pos="5040"/>
+        </w:tabs>
+        <w:ind w:left="5040" w:hanging="360"/>
+      </w:pPr>
+      <w:rPr>
+        <w:rFonts w:ascii="Wingdings" w:hAnsi="Wingdings" w:hint="default"/>
+        <w:sz w:val="20"/>
+      </w:rPr>
+    </w:lvl>
+    <w:lvl w:ilvl="7" w:tentative="1">
+      <w:start w:val="1"/>
+      <w:numFmt w:val="bullet"/>
+      <w:lvlText w:val=""/>
+      <w:lvlJc w:val="left"/>
+      <w:pPr>
+        <w:tabs>
+          <w:tab w:val="num" w:pos="5760"/>
+        </w:tabs>
+        <w:ind w:left="5760" w:hanging="360"/>
+      </w:pPr>
+      <w:rPr>
+        <w:rFonts w:ascii="Wingdings" w:hAnsi="Wingdings" w:hint="default"/>
+        <w:sz w:val="20"/>
+      </w:rPr>
+    </w:lvl>
+    <w:lvl w:ilvl="8" w:tentative="1">
+      <w:start w:val="1"/>
+      <w:numFmt w:val="bullet"/>
+      <w:lvlText w:val=""/>
+      <w:lvlJc w:val="left"/>
+      <w:pPr>
+        <w:tabs>
+          <w:tab w:val="num" w:pos="6480"/>
+        </w:tabs>
+        <w:ind w:left="6480" w:hanging="360"/>
+      </w:pPr>
+      <w:rPr>
+        <w:rFonts w:ascii="Wingdings" w:hAnsi="Wingdings" w:hint="default"/>
+        <w:sz w:val="20"/>
+      </w:rPr>
+    </w:lvl>
+  </w:abstractNum>
+  <w:abstractNum w:abstractNumId="5" w15:restartNumberingAfterBreak="0">
+    <w:nsid w:val="0A905EFD"/>
+    <w:multiLevelType w:val="multilevel"/>
+    <w:tmpl w:val="C7C8EF1C"/>
+    <w:lvl w:ilvl="0">
+      <w:start w:val="1"/>
+      <w:numFmt w:val="bullet"/>
+      <w:lvlText w:val=""/>
+      <w:lvlJc w:val="left"/>
+      <w:pPr>
+        <w:tabs>
+          <w:tab w:val="num" w:pos="720"/>
+        </w:tabs>
+        <w:ind w:left="720" w:hanging="360"/>
+      </w:pPr>
+      <w:rPr>
+        <w:rFonts w:ascii="Symbol" w:hAnsi="Symbol" w:hint="default"/>
+        <w:sz w:val="20"/>
+      </w:rPr>
+    </w:lvl>
+    <w:lvl w:ilvl="1" w:tentative="1">
+      <w:start w:val="1"/>
+      <w:numFmt w:val="bullet"/>
+      <w:lvlText w:val="o"/>
+      <w:lvlJc w:val="left"/>
+      <w:pPr>
+        <w:tabs>
+          <w:tab w:val="num" w:pos="1440"/>
+        </w:tabs>
+        <w:ind w:left="1440" w:hanging="360"/>
+      </w:pPr>
+      <w:rPr>
+        <w:rFonts w:ascii="Courier New" w:hAnsi="Courier New" w:hint="default"/>
+        <w:sz w:val="20"/>
+      </w:rPr>
+    </w:lvl>
+    <w:lvl w:ilvl="2" w:tentative="1">
+      <w:start w:val="1"/>
+      <w:numFmt w:val="bullet"/>
+      <w:lvlText w:val=""/>
+      <w:lvlJc w:val="left"/>
+      <w:pPr>
+        <w:tabs>
+          <w:tab w:val="num" w:pos="2160"/>
+        </w:tabs>
+        <w:ind w:left="2160" w:hanging="360"/>
+      </w:pPr>
+      <w:rPr>
+        <w:rFonts w:ascii="Wingdings" w:hAnsi="Wingdings" w:hint="default"/>
+        <w:sz w:val="20"/>
+      </w:rPr>
+    </w:lvl>
+    <w:lvl w:ilvl="3" w:tentative="1">
+      <w:start w:val="1"/>
+      <w:numFmt w:val="bullet"/>
+      <w:lvlText w:val=""/>
+      <w:lvlJc w:val="left"/>
+      <w:pPr>
+        <w:tabs>
+          <w:tab w:val="num" w:pos="2880"/>
+        </w:tabs>
+        <w:ind w:left="2880" w:hanging="360"/>
+      </w:pPr>
+      <w:rPr>
+        <w:rFonts w:ascii="Wingdings" w:hAnsi="Wingdings" w:hint="default"/>
+        <w:sz w:val="20"/>
+      </w:rPr>
+    </w:lvl>
+    <w:lvl w:ilvl="4" w:tentative="1">
+      <w:start w:val="1"/>
+      <w:numFmt w:val="bullet"/>
+      <w:lvlText w:val=""/>
+      <w:lvlJc w:val="left"/>
+      <w:pPr>
+        <w:tabs>
+          <w:tab w:val="num" w:pos="3600"/>
+        </w:tabs>
+        <w:ind w:left="3600" w:hanging="360"/>
+      </w:pPr>
+      <w:rPr>
+        <w:rFonts w:ascii="Wingdings" w:hAnsi="Wingdings" w:hint="default"/>
+        <w:sz w:val="20"/>
+      </w:rPr>
+    </w:lvl>
+    <w:lvl w:ilvl="5" w:tentative="1">
+      <w:start w:val="1"/>
+      <w:numFmt w:val="bullet"/>
+      <w:lvlText w:val=""/>
+      <w:lvlJc w:val="left"/>
+      <w:pPr>
+        <w:tabs>
+          <w:tab w:val="num" w:pos="4320"/>
+        </w:tabs>
+        <w:ind w:left="4320" w:hanging="360"/>
+      </w:pPr>
+      <w:rPr>
+        <w:rFonts w:ascii="Wingdings" w:hAnsi="Wingdings" w:hint="default"/>
+        <w:sz w:val="20"/>
+      </w:rPr>
+    </w:lvl>
+    <w:lvl w:ilvl="6" w:tentative="1">
+      <w:start w:val="1"/>
+      <w:numFmt w:val="bullet"/>
+      <w:lvlText w:val=""/>
+      <w:lvlJc w:val="left"/>
+      <w:pPr>
+        <w:tabs>
+          <w:tab w:val="num" w:pos="5040"/>
+        </w:tabs>
+        <w:ind w:left="5040" w:hanging="360"/>
+      </w:pPr>
+      <w:rPr>
+        <w:rFonts w:ascii="Wingdings" w:hAnsi="Wingdings" w:hint="default"/>
+        <w:sz w:val="20"/>
+      </w:rPr>
+    </w:lvl>
+    <w:lvl w:ilvl="7" w:tentative="1">
+      <w:start w:val="1"/>
+      <w:numFmt w:val="bullet"/>
+      <w:lvlText w:val=""/>
+      <w:lvlJc w:val="left"/>
+      <w:pPr>
+        <w:tabs>
+          <w:tab w:val="num" w:pos="5760"/>
+        </w:tabs>
+        <w:ind w:left="5760" w:hanging="360"/>
+      </w:pPr>
+      <w:rPr>
+        <w:rFonts w:ascii="Wingdings" w:hAnsi="Wingdings" w:hint="default"/>
+        <w:sz w:val="20"/>
+      </w:rPr>
+    </w:lvl>
+    <w:lvl w:ilvl="8" w:tentative="1">
+      <w:start w:val="1"/>
+      <w:numFmt w:val="bullet"/>
+      <w:lvlText w:val=""/>
+      <w:lvlJc w:val="left"/>
+      <w:pPr>
+        <w:tabs>
+          <w:tab w:val="num" w:pos="6480"/>
+        </w:tabs>
+        <w:ind w:left="6480" w:hanging="360"/>
+      </w:pPr>
+      <w:rPr>
+        <w:rFonts w:ascii="Wingdings" w:hAnsi="Wingdings" w:hint="default"/>
+        <w:sz w:val="20"/>
+      </w:rPr>
+    </w:lvl>
+  </w:abstractNum>
+  <w:abstractNum w:abstractNumId="6" w15:restartNumberingAfterBreak="0">
     <w:nsid w:val="0DCB5160"/>
     <w:multiLevelType w:val="hybridMultilevel"/>
     <w:tmpl w:val="07E2CFCA"/>
@@ -2012,7 +2580,7 @@
       </w:pPr>
     </w:lvl>
   </w:abstractNum>
-  <w:abstractNum w:abstractNumId="5" w15:restartNumberingAfterBreak="0">
+  <w:abstractNum w:abstractNumId="7" w15:restartNumberingAfterBreak="0">
     <w:nsid w:val="0FAB3CB5"/>
     <w:multiLevelType w:val="hybridMultilevel"/>
     <w:tmpl w:val="B0927B14"/>
@@ -2125,7 +2693,7 @@
       </w:rPr>
     </w:lvl>
   </w:abstractNum>
-  <w:abstractNum w:abstractNumId="6" w15:restartNumberingAfterBreak="0">
+  <w:abstractNum w:abstractNumId="8" w15:restartNumberingAfterBreak="0">
     <w:nsid w:val="10997043"/>
     <w:multiLevelType w:val="hybridMultilevel"/>
     <w:tmpl w:val="159E913E"/>
@@ -2238,7 +2806,7 @@
       </w:rPr>
     </w:lvl>
   </w:abstractNum>
-  <w:abstractNum w:abstractNumId="7" w15:restartNumberingAfterBreak="0">
+  <w:abstractNum w:abstractNumId="9" w15:restartNumberingAfterBreak="0">
     <w:nsid w:val="11B465C3"/>
     <w:multiLevelType w:val="hybridMultilevel"/>
     <w:tmpl w:val="4E6ACF9A"/>
@@ -2351,7 +2919,7 @@
       </w:rPr>
     </w:lvl>
   </w:abstractNum>
-  <w:abstractNum w:abstractNumId="8" w15:restartNumberingAfterBreak="0">
+  <w:abstractNum w:abstractNumId="10" w15:restartNumberingAfterBreak="0">
     <w:nsid w:val="18C7367E"/>
     <w:multiLevelType w:val="hybridMultilevel"/>
     <w:tmpl w:val="AE600562"/>
@@ -2464,7 +3032,7 @@
       </w:rPr>
     </w:lvl>
   </w:abstractNum>
-  <w:abstractNum w:abstractNumId="9" w15:restartNumberingAfterBreak="0">
+  <w:abstractNum w:abstractNumId="11" w15:restartNumberingAfterBreak="0">
     <w:nsid w:val="1B554F86"/>
     <w:multiLevelType w:val="hybridMultilevel"/>
     <w:tmpl w:val="813A1C88"/>
@@ -2576,7 +3144,156 @@
       </w:rPr>
     </w:lvl>
   </w:abstractNum>
-  <w:abstractNum w:abstractNumId="10" w15:restartNumberingAfterBreak="0">
+  <w:abstractNum w:abstractNumId="12" w15:restartNumberingAfterBreak="0">
+    <w:nsid w:val="1E1A71D3"/>
+    <w:multiLevelType w:val="multilevel"/>
+    <w:tmpl w:val="D638A25A"/>
+    <w:lvl w:ilvl="0">
+      <w:start w:val="1"/>
+      <w:numFmt w:val="bullet"/>
+      <w:lvlText w:val=""/>
+      <w:lvlJc w:val="left"/>
+      <w:pPr>
+        <w:tabs>
+          <w:tab w:val="num" w:pos="720"/>
+        </w:tabs>
+        <w:ind w:left="720" w:hanging="360"/>
+      </w:pPr>
+      <w:rPr>
+        <w:rFonts w:ascii="Symbol" w:hAnsi="Symbol" w:hint="default"/>
+        <w:sz w:val="20"/>
+      </w:rPr>
+    </w:lvl>
+    <w:lvl w:ilvl="1" w:tentative="1">
+      <w:start w:val="1"/>
+      <w:numFmt w:val="bullet"/>
+      <w:lvlText w:val="o"/>
+      <w:lvlJc w:val="left"/>
+      <w:pPr>
+        <w:tabs>
+          <w:tab w:val="num" w:pos="1440"/>
+        </w:tabs>
+        <w:ind w:left="1440" w:hanging="360"/>
+      </w:pPr>
+      <w:rPr>
+        <w:rFonts w:ascii="Courier New" w:hAnsi="Courier New" w:hint="default"/>
+        <w:sz w:val="20"/>
+      </w:rPr>
+    </w:lvl>
+    <w:lvl w:ilvl="2" w:tentative="1">
+      <w:start w:val="1"/>
+      <w:numFmt w:val="bullet"/>
+      <w:lvlText w:val=""/>
+      <w:lvlJc w:val="left"/>
+      <w:pPr>
+        <w:tabs>
+          <w:tab w:val="num" w:pos="2160"/>
+        </w:tabs>
+        <w:ind w:left="2160" w:hanging="360"/>
+      </w:pPr>
+      <w:rPr>
+        <w:rFonts w:ascii="Wingdings" w:hAnsi="Wingdings" w:hint="default"/>
+        <w:sz w:val="20"/>
+      </w:rPr>
+    </w:lvl>
+    <w:lvl w:ilvl="3" w:tentative="1">
+      <w:start w:val="1"/>
+      <w:numFmt w:val="bullet"/>
+      <w:lvlText w:val=""/>
+      <w:lvlJc w:val="left"/>
+      <w:pPr>
+        <w:tabs>
+          <w:tab w:val="num" w:pos="2880"/>
+        </w:tabs>
+        <w:ind w:left="2880" w:hanging="360"/>
+      </w:pPr>
+      <w:rPr>
+        <w:rFonts w:ascii="Wingdings" w:hAnsi="Wingdings" w:hint="default"/>
+        <w:sz w:val="20"/>
+      </w:rPr>
+    </w:lvl>
+    <w:lvl w:ilvl="4" w:tentative="1">
+      <w:start w:val="1"/>
+      <w:numFmt w:val="bullet"/>
+      <w:lvlText w:val=""/>
+      <w:lvlJc w:val="left"/>
+      <w:pPr>
+        <w:tabs>
+          <w:tab w:val="num" w:pos="3600"/>
+        </w:tabs>
+        <w:ind w:left="3600" w:hanging="360"/>
+      </w:pPr>
+      <w:rPr>
+        <w:rFonts w:ascii="Wingdings" w:hAnsi="Wingdings" w:hint="default"/>
+        <w:sz w:val="20"/>
+      </w:rPr>
+    </w:lvl>
+    <w:lvl w:ilvl="5" w:tentative="1">
+      <w:start w:val="1"/>
+      <w:numFmt w:val="bullet"/>
+      <w:lvlText w:val=""/>
+      <w:lvlJc w:val="left"/>
+      <w:pPr>
+        <w:tabs>
+          <w:tab w:val="num" w:pos="4320"/>
+        </w:tabs>
+        <w:ind w:left="4320" w:hanging="360"/>
+      </w:pPr>
+      <w:rPr>
+        <w:rFonts w:ascii="Wingdings" w:hAnsi="Wingdings" w:hint="default"/>
+        <w:sz w:val="20"/>
+      </w:rPr>
+    </w:lvl>
+    <w:lvl w:ilvl="6" w:tentative="1">
+      <w:start w:val="1"/>
+      <w:numFmt w:val="bullet"/>
+      <w:lvlText w:val=""/>
+      <w:lvlJc w:val="left"/>
+      <w:pPr>
+        <w:tabs>
+          <w:tab w:val="num" w:pos="5040"/>
+        </w:tabs>
+        <w:ind w:left="5040" w:hanging="360"/>
+      </w:pPr>
+      <w:rPr>
+        <w:rFonts w:ascii="Wingdings" w:hAnsi="Wingdings" w:hint="default"/>
+        <w:sz w:val="20"/>
+      </w:rPr>
+    </w:lvl>
+    <w:lvl w:ilvl="7" w:tentative="1">
+      <w:start w:val="1"/>
+      <w:numFmt w:val="bullet"/>
+      <w:lvlText w:val=""/>
+      <w:lvlJc w:val="left"/>
+      <w:pPr>
+        <w:tabs>
+          <w:tab w:val="num" w:pos="5760"/>
+        </w:tabs>
+        <w:ind w:left="5760" w:hanging="360"/>
+      </w:pPr>
+      <w:rPr>
+        <w:rFonts w:ascii="Wingdings" w:hAnsi="Wingdings" w:hint="default"/>
+        <w:sz w:val="20"/>
+      </w:rPr>
+    </w:lvl>
+    <w:lvl w:ilvl="8" w:tentative="1">
+      <w:start w:val="1"/>
+      <w:numFmt w:val="bullet"/>
+      <w:lvlText w:val=""/>
+      <w:lvlJc w:val="left"/>
+      <w:pPr>
+        <w:tabs>
+          <w:tab w:val="num" w:pos="6480"/>
+        </w:tabs>
+        <w:ind w:left="6480" w:hanging="360"/>
+      </w:pPr>
+      <w:rPr>
+        <w:rFonts w:ascii="Wingdings" w:hAnsi="Wingdings" w:hint="default"/>
+        <w:sz w:val="20"/>
+      </w:rPr>
+    </w:lvl>
+  </w:abstractNum>
+  <w:abstractNum w:abstractNumId="13" w15:restartNumberingAfterBreak="0">
     <w:nsid w:val="1EAA164F"/>
     <w:multiLevelType w:val="hybridMultilevel"/>
     <w:tmpl w:val="F99C86F2"/>
@@ -2689,7 +3406,7 @@
       </w:rPr>
     </w:lvl>
   </w:abstractNum>
-  <w:abstractNum w:abstractNumId="11" w15:restartNumberingAfterBreak="0">
+  <w:abstractNum w:abstractNumId="14" w15:restartNumberingAfterBreak="0">
     <w:nsid w:val="314B3E6D"/>
     <w:multiLevelType w:val="hybridMultilevel"/>
     <w:tmpl w:val="CBE6AEDE"/>
@@ -2778,7 +3495,156 @@
       </w:pPr>
     </w:lvl>
   </w:abstractNum>
-  <w:abstractNum w:abstractNumId="12" w15:restartNumberingAfterBreak="0">
+  <w:abstractNum w:abstractNumId="15" w15:restartNumberingAfterBreak="0">
+    <w:nsid w:val="382109C2"/>
+    <w:multiLevelType w:val="multilevel"/>
+    <w:tmpl w:val="0B4E03DA"/>
+    <w:lvl w:ilvl="0">
+      <w:start w:val="1"/>
+      <w:numFmt w:val="bullet"/>
+      <w:lvlText w:val=""/>
+      <w:lvlJc w:val="left"/>
+      <w:pPr>
+        <w:tabs>
+          <w:tab w:val="num" w:pos="720"/>
+        </w:tabs>
+        <w:ind w:left="720" w:hanging="360"/>
+      </w:pPr>
+      <w:rPr>
+        <w:rFonts w:ascii="Symbol" w:hAnsi="Symbol" w:hint="default"/>
+        <w:sz w:val="20"/>
+      </w:rPr>
+    </w:lvl>
+    <w:lvl w:ilvl="1">
+      <w:start w:val="1"/>
+      <w:numFmt w:val="bullet"/>
+      <w:lvlText w:val="o"/>
+      <w:lvlJc w:val="left"/>
+      <w:pPr>
+        <w:tabs>
+          <w:tab w:val="num" w:pos="1440"/>
+        </w:tabs>
+        <w:ind w:left="1440" w:hanging="360"/>
+      </w:pPr>
+      <w:rPr>
+        <w:rFonts w:ascii="Courier New" w:hAnsi="Courier New" w:hint="default"/>
+        <w:sz w:val="20"/>
+      </w:rPr>
+    </w:lvl>
+    <w:lvl w:ilvl="2" w:tentative="1">
+      <w:start w:val="1"/>
+      <w:numFmt w:val="bullet"/>
+      <w:lvlText w:val=""/>
+      <w:lvlJc w:val="left"/>
+      <w:pPr>
+        <w:tabs>
+          <w:tab w:val="num" w:pos="2160"/>
+        </w:tabs>
+        <w:ind w:left="2160" w:hanging="360"/>
+      </w:pPr>
+      <w:rPr>
+        <w:rFonts w:ascii="Wingdings" w:hAnsi="Wingdings" w:hint="default"/>
+        <w:sz w:val="20"/>
+      </w:rPr>
+    </w:lvl>
+    <w:lvl w:ilvl="3" w:tentative="1">
+      <w:start w:val="1"/>
+      <w:numFmt w:val="bullet"/>
+      <w:lvlText w:val=""/>
+      <w:lvlJc w:val="left"/>
+      <w:pPr>
+        <w:tabs>
+          <w:tab w:val="num" w:pos="2880"/>
+        </w:tabs>
+        <w:ind w:left="2880" w:hanging="360"/>
+      </w:pPr>
+      <w:rPr>
+        <w:rFonts w:ascii="Wingdings" w:hAnsi="Wingdings" w:hint="default"/>
+        <w:sz w:val="20"/>
+      </w:rPr>
+    </w:lvl>
+    <w:lvl w:ilvl="4" w:tentative="1">
+      <w:start w:val="1"/>
+      <w:numFmt w:val="bullet"/>
+      <w:lvlText w:val=""/>
+      <w:lvlJc w:val="left"/>
+      <w:pPr>
+        <w:tabs>
+          <w:tab w:val="num" w:pos="3600"/>
+        </w:tabs>
+        <w:ind w:left="3600" w:hanging="360"/>
+      </w:pPr>
+      <w:rPr>
+        <w:rFonts w:ascii="Wingdings" w:hAnsi="Wingdings" w:hint="default"/>
+        <w:sz w:val="20"/>
+      </w:rPr>
+    </w:lvl>
+    <w:lvl w:ilvl="5" w:tentative="1">
+      <w:start w:val="1"/>
+      <w:numFmt w:val="bullet"/>
+      <w:lvlText w:val=""/>
+      <w:lvlJc w:val="left"/>
+      <w:pPr>
+        <w:tabs>
+          <w:tab w:val="num" w:pos="4320"/>
+        </w:tabs>
+        <w:ind w:left="4320" w:hanging="360"/>
+      </w:pPr>
+      <w:rPr>
+        <w:rFonts w:ascii="Wingdings" w:hAnsi="Wingdings" w:hint="default"/>
+        <w:sz w:val="20"/>
+      </w:rPr>
+    </w:lvl>
+    <w:lvl w:ilvl="6" w:tentative="1">
+      <w:start w:val="1"/>
+      <w:numFmt w:val="bullet"/>
+      <w:lvlText w:val=""/>
+      <w:lvlJc w:val="left"/>
+      <w:pPr>
+        <w:tabs>
+          <w:tab w:val="num" w:pos="5040"/>
+        </w:tabs>
+        <w:ind w:left="5040" w:hanging="360"/>
+      </w:pPr>
+      <w:rPr>
+        <w:rFonts w:ascii="Wingdings" w:hAnsi="Wingdings" w:hint="default"/>
+        <w:sz w:val="20"/>
+      </w:rPr>
+    </w:lvl>
+    <w:lvl w:ilvl="7" w:tentative="1">
+      <w:start w:val="1"/>
+      <w:numFmt w:val="bullet"/>
+      <w:lvlText w:val=""/>
+      <w:lvlJc w:val="left"/>
+      <w:pPr>
+        <w:tabs>
+          <w:tab w:val="num" w:pos="5760"/>
+        </w:tabs>
+        <w:ind w:left="5760" w:hanging="360"/>
+      </w:pPr>
+      <w:rPr>
+        <w:rFonts w:ascii="Wingdings" w:hAnsi="Wingdings" w:hint="default"/>
+        <w:sz w:val="20"/>
+      </w:rPr>
+    </w:lvl>
+    <w:lvl w:ilvl="8" w:tentative="1">
+      <w:start w:val="1"/>
+      <w:numFmt w:val="bullet"/>
+      <w:lvlText w:val=""/>
+      <w:lvlJc w:val="left"/>
+      <w:pPr>
+        <w:tabs>
+          <w:tab w:val="num" w:pos="6480"/>
+        </w:tabs>
+        <w:ind w:left="6480" w:hanging="360"/>
+      </w:pPr>
+      <w:rPr>
+        <w:rFonts w:ascii="Wingdings" w:hAnsi="Wingdings" w:hint="default"/>
+        <w:sz w:val="20"/>
+      </w:rPr>
+    </w:lvl>
+  </w:abstractNum>
+  <w:abstractNum w:abstractNumId="16" w15:restartNumberingAfterBreak="0">
     <w:nsid w:val="3EA04479"/>
     <w:multiLevelType w:val="hybridMultilevel"/>
     <w:tmpl w:val="0E5072A6"/>
@@ -2867,7 +3733,156 @@
       </w:pPr>
     </w:lvl>
   </w:abstractNum>
-  <w:abstractNum w:abstractNumId="13" w15:restartNumberingAfterBreak="0">
+  <w:abstractNum w:abstractNumId="17" w15:restartNumberingAfterBreak="0">
+    <w:nsid w:val="41370A77"/>
+    <w:multiLevelType w:val="multilevel"/>
+    <w:tmpl w:val="4AE6B1B6"/>
+    <w:lvl w:ilvl="0">
+      <w:start w:val="1"/>
+      <w:numFmt w:val="bullet"/>
+      <w:lvlText w:val=""/>
+      <w:lvlJc w:val="left"/>
+      <w:pPr>
+        <w:tabs>
+          <w:tab w:val="num" w:pos="720"/>
+        </w:tabs>
+        <w:ind w:left="720" w:hanging="360"/>
+      </w:pPr>
+      <w:rPr>
+        <w:rFonts w:ascii="Symbol" w:hAnsi="Symbol" w:hint="default"/>
+        <w:sz w:val="20"/>
+      </w:rPr>
+    </w:lvl>
+    <w:lvl w:ilvl="1" w:tentative="1">
+      <w:start w:val="1"/>
+      <w:numFmt w:val="bullet"/>
+      <w:lvlText w:val="o"/>
+      <w:lvlJc w:val="left"/>
+      <w:pPr>
+        <w:tabs>
+          <w:tab w:val="num" w:pos="1440"/>
+        </w:tabs>
+        <w:ind w:left="1440" w:hanging="360"/>
+      </w:pPr>
+      <w:rPr>
+        <w:rFonts w:ascii="Courier New" w:hAnsi="Courier New" w:hint="default"/>
+        <w:sz w:val="20"/>
+      </w:rPr>
+    </w:lvl>
+    <w:lvl w:ilvl="2" w:tentative="1">
+      <w:start w:val="1"/>
+      <w:numFmt w:val="bullet"/>
+      <w:lvlText w:val=""/>
+      <w:lvlJc w:val="left"/>
+      <w:pPr>
+        <w:tabs>
+          <w:tab w:val="num" w:pos="2160"/>
+        </w:tabs>
+        <w:ind w:left="2160" w:hanging="360"/>
+      </w:pPr>
+      <w:rPr>
+        <w:rFonts w:ascii="Wingdings" w:hAnsi="Wingdings" w:hint="default"/>
+        <w:sz w:val="20"/>
+      </w:rPr>
+    </w:lvl>
+    <w:lvl w:ilvl="3" w:tentative="1">
+      <w:start w:val="1"/>
+      <w:numFmt w:val="bullet"/>
+      <w:lvlText w:val=""/>
+      <w:lvlJc w:val="left"/>
+      <w:pPr>
+        <w:tabs>
+          <w:tab w:val="num" w:pos="2880"/>
+        </w:tabs>
+        <w:ind w:left="2880" w:hanging="360"/>
+      </w:pPr>
+      <w:rPr>
+        <w:rFonts w:ascii="Wingdings" w:hAnsi="Wingdings" w:hint="default"/>
+        <w:sz w:val="20"/>
+      </w:rPr>
+    </w:lvl>
+    <w:lvl w:ilvl="4" w:tentative="1">
+      <w:start w:val="1"/>
+      <w:numFmt w:val="bullet"/>
+      <w:lvlText w:val=""/>
+      <w:lvlJc w:val="left"/>
+      <w:pPr>
+        <w:tabs>
+          <w:tab w:val="num" w:pos="3600"/>
+        </w:tabs>
+        <w:ind w:left="3600" w:hanging="360"/>
+      </w:pPr>
+      <w:rPr>
+        <w:rFonts w:ascii="Wingdings" w:hAnsi="Wingdings" w:hint="default"/>
+        <w:sz w:val="20"/>
+      </w:rPr>
+    </w:lvl>
+    <w:lvl w:ilvl="5" w:tentative="1">
+      <w:start w:val="1"/>
+      <w:numFmt w:val="bullet"/>
+      <w:lvlText w:val=""/>
+      <w:lvlJc w:val="left"/>
+      <w:pPr>
+        <w:tabs>
+          <w:tab w:val="num" w:pos="4320"/>
+        </w:tabs>
+        <w:ind w:left="4320" w:hanging="360"/>
+      </w:pPr>
+      <w:rPr>
+        <w:rFonts w:ascii="Wingdings" w:hAnsi="Wingdings" w:hint="default"/>
+        <w:sz w:val="20"/>
+      </w:rPr>
+    </w:lvl>
+    <w:lvl w:ilvl="6" w:tentative="1">
+      <w:start w:val="1"/>
+      <w:numFmt w:val="bullet"/>
+      <w:lvlText w:val=""/>
+      <w:lvlJc w:val="left"/>
+      <w:pPr>
+        <w:tabs>
+          <w:tab w:val="num" w:pos="5040"/>
+        </w:tabs>
+        <w:ind w:left="5040" w:hanging="360"/>
+      </w:pPr>
+      <w:rPr>
+        <w:rFonts w:ascii="Wingdings" w:hAnsi="Wingdings" w:hint="default"/>
+        <w:sz w:val="20"/>
+      </w:rPr>
+    </w:lvl>
+    <w:lvl w:ilvl="7" w:tentative="1">
+      <w:start w:val="1"/>
+      <w:numFmt w:val="bullet"/>
+      <w:lvlText w:val=""/>
+      <w:lvlJc w:val="left"/>
+      <w:pPr>
+        <w:tabs>
+          <w:tab w:val="num" w:pos="5760"/>
+        </w:tabs>
+        <w:ind w:left="5760" w:hanging="360"/>
+      </w:pPr>
+      <w:rPr>
+        <w:rFonts w:ascii="Wingdings" w:hAnsi="Wingdings" w:hint="default"/>
+        <w:sz w:val="20"/>
+      </w:rPr>
+    </w:lvl>
+    <w:lvl w:ilvl="8" w:tentative="1">
+      <w:start w:val="1"/>
+      <w:numFmt w:val="bullet"/>
+      <w:lvlText w:val=""/>
+      <w:lvlJc w:val="left"/>
+      <w:pPr>
+        <w:tabs>
+          <w:tab w:val="num" w:pos="6480"/>
+        </w:tabs>
+        <w:ind w:left="6480" w:hanging="360"/>
+      </w:pPr>
+      <w:rPr>
+        <w:rFonts w:ascii="Wingdings" w:hAnsi="Wingdings" w:hint="default"/>
+        <w:sz w:val="20"/>
+      </w:rPr>
+    </w:lvl>
+  </w:abstractNum>
+  <w:abstractNum w:abstractNumId="18" w15:restartNumberingAfterBreak="0">
     <w:nsid w:val="41BE5729"/>
     <w:multiLevelType w:val="hybridMultilevel"/>
     <w:tmpl w:val="21B0AE8A"/>
@@ -2980,7 +3995,156 @@
       </w:rPr>
     </w:lvl>
   </w:abstractNum>
-  <w:abstractNum w:abstractNumId="14" w15:restartNumberingAfterBreak="0">
+  <w:abstractNum w:abstractNumId="19" w15:restartNumberingAfterBreak="0">
+    <w:nsid w:val="41CD1A3A"/>
+    <w:multiLevelType w:val="multilevel"/>
+    <w:tmpl w:val="B25266E6"/>
+    <w:lvl w:ilvl="0">
+      <w:start w:val="1"/>
+      <w:numFmt w:val="bullet"/>
+      <w:lvlText w:val=""/>
+      <w:lvlJc w:val="left"/>
+      <w:pPr>
+        <w:tabs>
+          <w:tab w:val="num" w:pos="720"/>
+        </w:tabs>
+        <w:ind w:left="720" w:hanging="360"/>
+      </w:pPr>
+      <w:rPr>
+        <w:rFonts w:ascii="Symbol" w:hAnsi="Symbol" w:hint="default"/>
+        <w:sz w:val="20"/>
+      </w:rPr>
+    </w:lvl>
+    <w:lvl w:ilvl="1">
+      <w:start w:val="1"/>
+      <w:numFmt w:val="bullet"/>
+      <w:lvlText w:val="o"/>
+      <w:lvlJc w:val="left"/>
+      <w:pPr>
+        <w:tabs>
+          <w:tab w:val="num" w:pos="1440"/>
+        </w:tabs>
+        <w:ind w:left="1440" w:hanging="360"/>
+      </w:pPr>
+      <w:rPr>
+        <w:rFonts w:ascii="Courier New" w:hAnsi="Courier New" w:hint="default"/>
+        <w:sz w:val="20"/>
+      </w:rPr>
+    </w:lvl>
+    <w:lvl w:ilvl="2" w:tentative="1">
+      <w:start w:val="1"/>
+      <w:numFmt w:val="bullet"/>
+      <w:lvlText w:val=""/>
+      <w:lvlJc w:val="left"/>
+      <w:pPr>
+        <w:tabs>
+          <w:tab w:val="num" w:pos="2160"/>
+        </w:tabs>
+        <w:ind w:left="2160" w:hanging="360"/>
+      </w:pPr>
+      <w:rPr>
+        <w:rFonts w:ascii="Wingdings" w:hAnsi="Wingdings" w:hint="default"/>
+        <w:sz w:val="20"/>
+      </w:rPr>
+    </w:lvl>
+    <w:lvl w:ilvl="3" w:tentative="1">
+      <w:start w:val="1"/>
+      <w:numFmt w:val="bullet"/>
+      <w:lvlText w:val=""/>
+      <w:lvlJc w:val="left"/>
+      <w:pPr>
+        <w:tabs>
+          <w:tab w:val="num" w:pos="2880"/>
+        </w:tabs>
+        <w:ind w:left="2880" w:hanging="360"/>
+      </w:pPr>
+      <w:rPr>
+        <w:rFonts w:ascii="Wingdings" w:hAnsi="Wingdings" w:hint="default"/>
+        <w:sz w:val="20"/>
+      </w:rPr>
+    </w:lvl>
+    <w:lvl w:ilvl="4" w:tentative="1">
+      <w:start w:val="1"/>
+      <w:numFmt w:val="bullet"/>
+      <w:lvlText w:val=""/>
+      <w:lvlJc w:val="left"/>
+      <w:pPr>
+        <w:tabs>
+          <w:tab w:val="num" w:pos="3600"/>
+        </w:tabs>
+        <w:ind w:left="3600" w:hanging="360"/>
+      </w:pPr>
+      <w:rPr>
+        <w:rFonts w:ascii="Wingdings" w:hAnsi="Wingdings" w:hint="default"/>
+        <w:sz w:val="20"/>
+      </w:rPr>
+    </w:lvl>
+    <w:lvl w:ilvl="5" w:tentative="1">
+      <w:start w:val="1"/>
+      <w:numFmt w:val="bullet"/>
+      <w:lvlText w:val=""/>
+      <w:lvlJc w:val="left"/>
+      <w:pPr>
+        <w:tabs>
+          <w:tab w:val="num" w:pos="4320"/>
+        </w:tabs>
+        <w:ind w:left="4320" w:hanging="360"/>
+      </w:pPr>
+      <w:rPr>
+        <w:rFonts w:ascii="Wingdings" w:hAnsi="Wingdings" w:hint="default"/>
+        <w:sz w:val="20"/>
+      </w:rPr>
+    </w:lvl>
+    <w:lvl w:ilvl="6" w:tentative="1">
+      <w:start w:val="1"/>
+      <w:numFmt w:val="bullet"/>
+      <w:lvlText w:val=""/>
+      <w:lvlJc w:val="left"/>
+      <w:pPr>
+        <w:tabs>
+          <w:tab w:val="num" w:pos="5040"/>
+        </w:tabs>
+        <w:ind w:left="5040" w:hanging="360"/>
+      </w:pPr>
+      <w:rPr>
+        <w:rFonts w:ascii="Wingdings" w:hAnsi="Wingdings" w:hint="default"/>
+        <w:sz w:val="20"/>
+      </w:rPr>
+    </w:lvl>
+    <w:lvl w:ilvl="7" w:tentative="1">
+      <w:start w:val="1"/>
+      <w:numFmt w:val="bullet"/>
+      <w:lvlText w:val=""/>
+      <w:lvlJc w:val="left"/>
+      <w:pPr>
+        <w:tabs>
+          <w:tab w:val="num" w:pos="5760"/>
+        </w:tabs>
+        <w:ind w:left="5760" w:hanging="360"/>
+      </w:pPr>
+      <w:rPr>
+        <w:rFonts w:ascii="Wingdings" w:hAnsi="Wingdings" w:hint="default"/>
+        <w:sz w:val="20"/>
+      </w:rPr>
+    </w:lvl>
+    <w:lvl w:ilvl="8" w:tentative="1">
+      <w:start w:val="1"/>
+      <w:numFmt w:val="bullet"/>
+      <w:lvlText w:val=""/>
+      <w:lvlJc w:val="left"/>
+      <w:pPr>
+        <w:tabs>
+          <w:tab w:val="num" w:pos="6480"/>
+        </w:tabs>
+        <w:ind w:left="6480" w:hanging="360"/>
+      </w:pPr>
+      <w:rPr>
+        <w:rFonts w:ascii="Wingdings" w:hAnsi="Wingdings" w:hint="default"/>
+        <w:sz w:val="20"/>
+      </w:rPr>
+    </w:lvl>
+  </w:abstractNum>
+  <w:abstractNum w:abstractNumId="20" w15:restartNumberingAfterBreak="0">
     <w:nsid w:val="43085F0B"/>
     <w:multiLevelType w:val="hybridMultilevel"/>
     <w:tmpl w:val="039CED4A"/>
@@ -3093,7 +4257,7 @@
       </w:rPr>
     </w:lvl>
   </w:abstractNum>
-  <w:abstractNum w:abstractNumId="15" w15:restartNumberingAfterBreak="0">
+  <w:abstractNum w:abstractNumId="21" w15:restartNumberingAfterBreak="0">
     <w:nsid w:val="4B3044D4"/>
     <w:multiLevelType w:val="hybridMultilevel"/>
     <w:tmpl w:val="D03298DA"/>
@@ -3206,7 +4370,7 @@
       </w:rPr>
     </w:lvl>
   </w:abstractNum>
-  <w:abstractNum w:abstractNumId="16" w15:restartNumberingAfterBreak="0">
+  <w:abstractNum w:abstractNumId="22" w15:restartNumberingAfterBreak="0">
     <w:nsid w:val="4B566DE9"/>
     <w:multiLevelType w:val="hybridMultilevel"/>
     <w:tmpl w:val="9A9E2DF2"/>
@@ -3318,7 +4482,7 @@
       </w:rPr>
     </w:lvl>
   </w:abstractNum>
-  <w:abstractNum w:abstractNumId="17" w15:restartNumberingAfterBreak="0">
+  <w:abstractNum w:abstractNumId="23" w15:restartNumberingAfterBreak="0">
     <w:nsid w:val="4FA52260"/>
     <w:multiLevelType w:val="hybridMultilevel"/>
     <w:tmpl w:val="B5A28BCA"/>
@@ -3431,7 +4595,7 @@
       </w:rPr>
     </w:lvl>
   </w:abstractNum>
-  <w:abstractNum w:abstractNumId="18" w15:restartNumberingAfterBreak="0">
+  <w:abstractNum w:abstractNumId="24" w15:restartNumberingAfterBreak="0">
     <w:nsid w:val="4FFD5D2A"/>
     <w:multiLevelType w:val="hybridMultilevel"/>
     <w:tmpl w:val="C71E8786"/>
@@ -3544,7 +4708,7 @@
       </w:rPr>
     </w:lvl>
   </w:abstractNum>
-  <w:abstractNum w:abstractNumId="19" w15:restartNumberingAfterBreak="0">
+  <w:abstractNum w:abstractNumId="25" w15:restartNumberingAfterBreak="0">
     <w:nsid w:val="530476F0"/>
     <w:multiLevelType w:val="hybridMultilevel"/>
     <w:tmpl w:val="419C5184"/>
@@ -3657,7 +4821,156 @@
       </w:rPr>
     </w:lvl>
   </w:abstractNum>
-  <w:abstractNum w:abstractNumId="20" w15:restartNumberingAfterBreak="0">
+  <w:abstractNum w:abstractNumId="26" w15:restartNumberingAfterBreak="0">
+    <w:nsid w:val="55E87134"/>
+    <w:multiLevelType w:val="multilevel"/>
+    <w:tmpl w:val="4E2ECDF4"/>
+    <w:lvl w:ilvl="0">
+      <w:start w:val="1"/>
+      <w:numFmt w:val="bullet"/>
+      <w:lvlText w:val=""/>
+      <w:lvlJc w:val="left"/>
+      <w:pPr>
+        <w:tabs>
+          <w:tab w:val="num" w:pos="720"/>
+        </w:tabs>
+        <w:ind w:left="720" w:hanging="360"/>
+      </w:pPr>
+      <w:rPr>
+        <w:rFonts w:ascii="Symbol" w:hAnsi="Symbol" w:hint="default"/>
+        <w:sz w:val="20"/>
+      </w:rPr>
+    </w:lvl>
+    <w:lvl w:ilvl="1" w:tentative="1">
+      <w:start w:val="1"/>
+      <w:numFmt w:val="bullet"/>
+      <w:lvlText w:val="o"/>
+      <w:lvlJc w:val="left"/>
+      <w:pPr>
+        <w:tabs>
+          <w:tab w:val="num" w:pos="1440"/>
+        </w:tabs>
+        <w:ind w:left="1440" w:hanging="360"/>
+      </w:pPr>
+      <w:rPr>
+        <w:rFonts w:ascii="Courier New" w:hAnsi="Courier New" w:hint="default"/>
+        <w:sz w:val="20"/>
+      </w:rPr>
+    </w:lvl>
+    <w:lvl w:ilvl="2" w:tentative="1">
+      <w:start w:val="1"/>
+      <w:numFmt w:val="bullet"/>
+      <w:lvlText w:val=""/>
+      <w:lvlJc w:val="left"/>
+      <w:pPr>
+        <w:tabs>
+          <w:tab w:val="num" w:pos="2160"/>
+        </w:tabs>
+        <w:ind w:left="2160" w:hanging="360"/>
+      </w:pPr>
+      <w:rPr>
+        <w:rFonts w:ascii="Wingdings" w:hAnsi="Wingdings" w:hint="default"/>
+        <w:sz w:val="20"/>
+      </w:rPr>
+    </w:lvl>
+    <w:lvl w:ilvl="3" w:tentative="1">
+      <w:start w:val="1"/>
+      <w:numFmt w:val="bullet"/>
+      <w:lvlText w:val=""/>
+      <w:lvlJc w:val="left"/>
+      <w:pPr>
+        <w:tabs>
+          <w:tab w:val="num" w:pos="2880"/>
+        </w:tabs>
+        <w:ind w:left="2880" w:hanging="360"/>
+      </w:pPr>
+      <w:rPr>
+        <w:rFonts w:ascii="Wingdings" w:hAnsi="Wingdings" w:hint="default"/>
+        <w:sz w:val="20"/>
+      </w:rPr>
+    </w:lvl>
+    <w:lvl w:ilvl="4" w:tentative="1">
+      <w:start w:val="1"/>
+      <w:numFmt w:val="bullet"/>
+      <w:lvlText w:val=""/>
+      <w:lvlJc w:val="left"/>
+      <w:pPr>
+        <w:tabs>
+          <w:tab w:val="num" w:pos="3600"/>
+        </w:tabs>
+        <w:ind w:left="3600" w:hanging="360"/>
+      </w:pPr>
+      <w:rPr>
+        <w:rFonts w:ascii="Wingdings" w:hAnsi="Wingdings" w:hint="default"/>
+        <w:sz w:val="20"/>
+      </w:rPr>
+    </w:lvl>
+    <w:lvl w:ilvl="5" w:tentative="1">
+      <w:start w:val="1"/>
+      <w:numFmt w:val="bullet"/>
+      <w:lvlText w:val=""/>
+      <w:lvlJc w:val="left"/>
+      <w:pPr>
+        <w:tabs>
+          <w:tab w:val="num" w:pos="4320"/>
+        </w:tabs>
+        <w:ind w:left="4320" w:hanging="360"/>
+      </w:pPr>
+      <w:rPr>
+        <w:rFonts w:ascii="Wingdings" w:hAnsi="Wingdings" w:hint="default"/>
+        <w:sz w:val="20"/>
+      </w:rPr>
+    </w:lvl>
+    <w:lvl w:ilvl="6" w:tentative="1">
+      <w:start w:val="1"/>
+      <w:numFmt w:val="bullet"/>
+      <w:lvlText w:val=""/>
+      <w:lvlJc w:val="left"/>
+      <w:pPr>
+        <w:tabs>
+          <w:tab w:val="num" w:pos="5040"/>
+        </w:tabs>
+        <w:ind w:left="5040" w:hanging="360"/>
+      </w:pPr>
+      <w:rPr>
+        <w:rFonts w:ascii="Wingdings" w:hAnsi="Wingdings" w:hint="default"/>
+        <w:sz w:val="20"/>
+      </w:rPr>
+    </w:lvl>
+    <w:lvl w:ilvl="7" w:tentative="1">
+      <w:start w:val="1"/>
+      <w:numFmt w:val="bullet"/>
+      <w:lvlText w:val=""/>
+      <w:lvlJc w:val="left"/>
+      <w:pPr>
+        <w:tabs>
+          <w:tab w:val="num" w:pos="5760"/>
+        </w:tabs>
+        <w:ind w:left="5760" w:hanging="360"/>
+      </w:pPr>
+      <w:rPr>
+        <w:rFonts w:ascii="Wingdings" w:hAnsi="Wingdings" w:hint="default"/>
+        <w:sz w:val="20"/>
+      </w:rPr>
+    </w:lvl>
+    <w:lvl w:ilvl="8" w:tentative="1">
+      <w:start w:val="1"/>
+      <w:numFmt w:val="bullet"/>
+      <w:lvlText w:val=""/>
+      <w:lvlJc w:val="left"/>
+      <w:pPr>
+        <w:tabs>
+          <w:tab w:val="num" w:pos="6480"/>
+        </w:tabs>
+        <w:ind w:left="6480" w:hanging="360"/>
+      </w:pPr>
+      <w:rPr>
+        <w:rFonts w:ascii="Wingdings" w:hAnsi="Wingdings" w:hint="default"/>
+        <w:sz w:val="20"/>
+      </w:rPr>
+    </w:lvl>
+  </w:abstractNum>
+  <w:abstractNum w:abstractNumId="27" w15:restartNumberingAfterBreak="0">
     <w:nsid w:val="5F383B77"/>
     <w:multiLevelType w:val="hybridMultilevel"/>
     <w:tmpl w:val="0602D46C"/>
@@ -3770,7 +5083,7 @@
       </w:rPr>
     </w:lvl>
   </w:abstractNum>
-  <w:abstractNum w:abstractNumId="21" w15:restartNumberingAfterBreak="0">
+  <w:abstractNum w:abstractNumId="28" w15:restartNumberingAfterBreak="0">
     <w:nsid w:val="6516574A"/>
     <w:multiLevelType w:val="hybridMultilevel"/>
     <w:tmpl w:val="8A3A742E"/>
@@ -3786,7 +5099,7 @@
         <w:rFonts w:ascii="Symbol" w:hAnsi="Symbol" w:hint="default"/>
       </w:rPr>
     </w:lvl>
-    <w:lvl w:ilvl="1" w:tplc="FFFFFFFF" w:tentative="1">
+    <w:lvl w:ilvl="1" w:tplc="FFFFFFFF">
       <w:start w:val="1"/>
       <w:numFmt w:val="bullet"/>
       <w:lvlText w:val="o"/>
@@ -3798,7 +5111,7 @@
         <w:rFonts w:ascii="Courier New" w:hAnsi="Courier New" w:cs="Courier New" w:hint="default"/>
       </w:rPr>
     </w:lvl>
-    <w:lvl w:ilvl="2" w:tplc="FFFFFFFF" w:tentative="1">
+    <w:lvl w:ilvl="2" w:tplc="FFFFFFFF">
       <w:start w:val="1"/>
       <w:numFmt w:val="bullet"/>
       <w:lvlText w:val=""/>
@@ -3883,7 +5196,7 @@
       </w:rPr>
     </w:lvl>
   </w:abstractNum>
-  <w:abstractNum w:abstractNumId="22" w15:restartNumberingAfterBreak="0">
+  <w:abstractNum w:abstractNumId="29" w15:restartNumberingAfterBreak="0">
     <w:nsid w:val="681422A9"/>
     <w:multiLevelType w:val="hybridMultilevel"/>
     <w:tmpl w:val="8C26FC76"/>
@@ -3995,7 +5308,7 @@
       </w:rPr>
     </w:lvl>
   </w:abstractNum>
-  <w:abstractNum w:abstractNumId="23" w15:restartNumberingAfterBreak="0">
+  <w:abstractNum w:abstractNumId="30" w15:restartNumberingAfterBreak="0">
     <w:nsid w:val="6906649F"/>
     <w:multiLevelType w:val="hybridMultilevel"/>
     <w:tmpl w:val="CC44C9E0"/>
@@ -4081,7 +5394,7 @@
       </w:pPr>
     </w:lvl>
   </w:abstractNum>
-  <w:abstractNum w:abstractNumId="24" w15:restartNumberingAfterBreak="0">
+  <w:abstractNum w:abstractNumId="31" w15:restartNumberingAfterBreak="0">
     <w:nsid w:val="6947064C"/>
     <w:multiLevelType w:val="hybridMultilevel"/>
     <w:tmpl w:val="E670FC54"/>
@@ -4194,7 +5507,156 @@
       </w:rPr>
     </w:lvl>
   </w:abstractNum>
-  <w:abstractNum w:abstractNumId="25" w15:restartNumberingAfterBreak="0">
+  <w:abstractNum w:abstractNumId="32" w15:restartNumberingAfterBreak="0">
+    <w:nsid w:val="69662905"/>
+    <w:multiLevelType w:val="multilevel"/>
+    <w:tmpl w:val="B9522C9E"/>
+    <w:lvl w:ilvl="0">
+      <w:start w:val="1"/>
+      <w:numFmt w:val="bullet"/>
+      <w:lvlText w:val=""/>
+      <w:lvlJc w:val="left"/>
+      <w:pPr>
+        <w:tabs>
+          <w:tab w:val="num" w:pos="720"/>
+        </w:tabs>
+        <w:ind w:left="720" w:hanging="360"/>
+      </w:pPr>
+      <w:rPr>
+        <w:rFonts w:ascii="Symbol" w:hAnsi="Symbol" w:hint="default"/>
+        <w:sz w:val="20"/>
+      </w:rPr>
+    </w:lvl>
+    <w:lvl w:ilvl="1" w:tentative="1">
+      <w:start w:val="1"/>
+      <w:numFmt w:val="bullet"/>
+      <w:lvlText w:val="o"/>
+      <w:lvlJc w:val="left"/>
+      <w:pPr>
+        <w:tabs>
+          <w:tab w:val="num" w:pos="1440"/>
+        </w:tabs>
+        <w:ind w:left="1440" w:hanging="360"/>
+      </w:pPr>
+      <w:rPr>
+        <w:rFonts w:ascii="Courier New" w:hAnsi="Courier New" w:hint="default"/>
+        <w:sz w:val="20"/>
+      </w:rPr>
+    </w:lvl>
+    <w:lvl w:ilvl="2" w:tentative="1">
+      <w:start w:val="1"/>
+      <w:numFmt w:val="bullet"/>
+      <w:lvlText w:val=""/>
+      <w:lvlJc w:val="left"/>
+      <w:pPr>
+        <w:tabs>
+          <w:tab w:val="num" w:pos="2160"/>
+        </w:tabs>
+        <w:ind w:left="2160" w:hanging="360"/>
+      </w:pPr>
+      <w:rPr>
+        <w:rFonts w:ascii="Wingdings" w:hAnsi="Wingdings" w:hint="default"/>
+        <w:sz w:val="20"/>
+      </w:rPr>
+    </w:lvl>
+    <w:lvl w:ilvl="3" w:tentative="1">
+      <w:start w:val="1"/>
+      <w:numFmt w:val="bullet"/>
+      <w:lvlText w:val=""/>
+      <w:lvlJc w:val="left"/>
+      <w:pPr>
+        <w:tabs>
+          <w:tab w:val="num" w:pos="2880"/>
+        </w:tabs>
+        <w:ind w:left="2880" w:hanging="360"/>
+      </w:pPr>
+      <w:rPr>
+        <w:rFonts w:ascii="Wingdings" w:hAnsi="Wingdings" w:hint="default"/>
+        <w:sz w:val="20"/>
+      </w:rPr>
+    </w:lvl>
+    <w:lvl w:ilvl="4" w:tentative="1">
+      <w:start w:val="1"/>
+      <w:numFmt w:val="bullet"/>
+      <w:lvlText w:val=""/>
+      <w:lvlJc w:val="left"/>
+      <w:pPr>
+        <w:tabs>
+          <w:tab w:val="num" w:pos="3600"/>
+        </w:tabs>
+        <w:ind w:left="3600" w:hanging="360"/>
+      </w:pPr>
+      <w:rPr>
+        <w:rFonts w:ascii="Wingdings" w:hAnsi="Wingdings" w:hint="default"/>
+        <w:sz w:val="20"/>
+      </w:rPr>
+    </w:lvl>
+    <w:lvl w:ilvl="5" w:tentative="1">
+      <w:start w:val="1"/>
+      <w:numFmt w:val="bullet"/>
+      <w:lvlText w:val=""/>
+      <w:lvlJc w:val="left"/>
+      <w:pPr>
+        <w:tabs>
+          <w:tab w:val="num" w:pos="4320"/>
+        </w:tabs>
+        <w:ind w:left="4320" w:hanging="360"/>
+      </w:pPr>
+      <w:rPr>
+        <w:rFonts w:ascii="Wingdings" w:hAnsi="Wingdings" w:hint="default"/>
+        <w:sz w:val="20"/>
+      </w:rPr>
+    </w:lvl>
+    <w:lvl w:ilvl="6" w:tentative="1">
+      <w:start w:val="1"/>
+      <w:numFmt w:val="bullet"/>
+      <w:lvlText w:val=""/>
+      <w:lvlJc w:val="left"/>
+      <w:pPr>
+        <w:tabs>
+          <w:tab w:val="num" w:pos="5040"/>
+        </w:tabs>
+        <w:ind w:left="5040" w:hanging="360"/>
+      </w:pPr>
+      <w:rPr>
+        <w:rFonts w:ascii="Wingdings" w:hAnsi="Wingdings" w:hint="default"/>
+        <w:sz w:val="20"/>
+      </w:rPr>
+    </w:lvl>
+    <w:lvl w:ilvl="7" w:tentative="1">
+      <w:start w:val="1"/>
+      <w:numFmt w:val="bullet"/>
+      <w:lvlText w:val=""/>
+      <w:lvlJc w:val="left"/>
+      <w:pPr>
+        <w:tabs>
+          <w:tab w:val="num" w:pos="5760"/>
+        </w:tabs>
+        <w:ind w:left="5760" w:hanging="360"/>
+      </w:pPr>
+      <w:rPr>
+        <w:rFonts w:ascii="Wingdings" w:hAnsi="Wingdings" w:hint="default"/>
+        <w:sz w:val="20"/>
+      </w:rPr>
+    </w:lvl>
+    <w:lvl w:ilvl="8" w:tentative="1">
+      <w:start w:val="1"/>
+      <w:numFmt w:val="bullet"/>
+      <w:lvlText w:val=""/>
+      <w:lvlJc w:val="left"/>
+      <w:pPr>
+        <w:tabs>
+          <w:tab w:val="num" w:pos="6480"/>
+        </w:tabs>
+        <w:ind w:left="6480" w:hanging="360"/>
+      </w:pPr>
+      <w:rPr>
+        <w:rFonts w:ascii="Wingdings" w:hAnsi="Wingdings" w:hint="default"/>
+        <w:sz w:val="20"/>
+      </w:rPr>
+    </w:lvl>
+  </w:abstractNum>
+  <w:abstractNum w:abstractNumId="33" w15:restartNumberingAfterBreak="0">
     <w:nsid w:val="719E035B"/>
     <w:multiLevelType w:val="hybridMultilevel"/>
     <w:tmpl w:val="E4C4AE46"/>
@@ -4307,7 +5769,7 @@
       </w:rPr>
     </w:lvl>
   </w:abstractNum>
-  <w:abstractNum w:abstractNumId="26" w15:restartNumberingAfterBreak="0">
+  <w:abstractNum w:abstractNumId="34" w15:restartNumberingAfterBreak="0">
     <w:nsid w:val="75725F9C"/>
     <w:multiLevelType w:val="hybridMultilevel"/>
     <w:tmpl w:val="E98891C4"/>
@@ -4419,7 +5881,156 @@
       </w:rPr>
     </w:lvl>
   </w:abstractNum>
-  <w:abstractNum w:abstractNumId="27" w15:restartNumberingAfterBreak="0">
+  <w:abstractNum w:abstractNumId="35" w15:restartNumberingAfterBreak="0">
+    <w:nsid w:val="7DAA3F9C"/>
+    <w:multiLevelType w:val="multilevel"/>
+    <w:tmpl w:val="FF3A0FD4"/>
+    <w:lvl w:ilvl="0">
+      <w:start w:val="1"/>
+      <w:numFmt w:val="bullet"/>
+      <w:lvlText w:val=""/>
+      <w:lvlJc w:val="left"/>
+      <w:pPr>
+        <w:tabs>
+          <w:tab w:val="num" w:pos="720"/>
+        </w:tabs>
+        <w:ind w:left="720" w:hanging="360"/>
+      </w:pPr>
+      <w:rPr>
+        <w:rFonts w:ascii="Symbol" w:hAnsi="Symbol" w:hint="default"/>
+        <w:sz w:val="20"/>
+      </w:rPr>
+    </w:lvl>
+    <w:lvl w:ilvl="1" w:tentative="1">
+      <w:start w:val="1"/>
+      <w:numFmt w:val="bullet"/>
+      <w:lvlText w:val="o"/>
+      <w:lvlJc w:val="left"/>
+      <w:pPr>
+        <w:tabs>
+          <w:tab w:val="num" w:pos="1440"/>
+        </w:tabs>
+        <w:ind w:left="1440" w:hanging="360"/>
+      </w:pPr>
+      <w:rPr>
+        <w:rFonts w:ascii="Courier New" w:hAnsi="Courier New" w:hint="default"/>
+        <w:sz w:val="20"/>
+      </w:rPr>
+    </w:lvl>
+    <w:lvl w:ilvl="2" w:tentative="1">
+      <w:start w:val="1"/>
+      <w:numFmt w:val="bullet"/>
+      <w:lvlText w:val=""/>
+      <w:lvlJc w:val="left"/>
+      <w:pPr>
+        <w:tabs>
+          <w:tab w:val="num" w:pos="2160"/>
+        </w:tabs>
+        <w:ind w:left="2160" w:hanging="360"/>
+      </w:pPr>
+      <w:rPr>
+        <w:rFonts w:ascii="Wingdings" w:hAnsi="Wingdings" w:hint="default"/>
+        <w:sz w:val="20"/>
+      </w:rPr>
+    </w:lvl>
+    <w:lvl w:ilvl="3" w:tentative="1">
+      <w:start w:val="1"/>
+      <w:numFmt w:val="bullet"/>
+      <w:lvlText w:val=""/>
+      <w:lvlJc w:val="left"/>
+      <w:pPr>
+        <w:tabs>
+          <w:tab w:val="num" w:pos="2880"/>
+        </w:tabs>
+        <w:ind w:left="2880" w:hanging="360"/>
+      </w:pPr>
+      <w:rPr>
+        <w:rFonts w:ascii="Wingdings" w:hAnsi="Wingdings" w:hint="default"/>
+        <w:sz w:val="20"/>
+      </w:rPr>
+    </w:lvl>
+    <w:lvl w:ilvl="4" w:tentative="1">
+      <w:start w:val="1"/>
+      <w:numFmt w:val="bullet"/>
+      <w:lvlText w:val=""/>
+      <w:lvlJc w:val="left"/>
+      <w:pPr>
+        <w:tabs>
+          <w:tab w:val="num" w:pos="3600"/>
+        </w:tabs>
+        <w:ind w:left="3600" w:hanging="360"/>
+      </w:pPr>
+      <w:rPr>
+        <w:rFonts w:ascii="Wingdings" w:hAnsi="Wingdings" w:hint="default"/>
+        <w:sz w:val="20"/>
+      </w:rPr>
+    </w:lvl>
+    <w:lvl w:ilvl="5" w:tentative="1">
+      <w:start w:val="1"/>
+      <w:numFmt w:val="bullet"/>
+      <w:lvlText w:val=""/>
+      <w:lvlJc w:val="left"/>
+      <w:pPr>
+        <w:tabs>
+          <w:tab w:val="num" w:pos="4320"/>
+        </w:tabs>
+        <w:ind w:left="4320" w:hanging="360"/>
+      </w:pPr>
+      <w:rPr>
+        <w:rFonts w:ascii="Wingdings" w:hAnsi="Wingdings" w:hint="default"/>
+        <w:sz w:val="20"/>
+      </w:rPr>
+    </w:lvl>
+    <w:lvl w:ilvl="6" w:tentative="1">
+      <w:start w:val="1"/>
+      <w:numFmt w:val="bullet"/>
+      <w:lvlText w:val=""/>
+      <w:lvlJc w:val="left"/>
+      <w:pPr>
+        <w:tabs>
+          <w:tab w:val="num" w:pos="5040"/>
+        </w:tabs>
+        <w:ind w:left="5040" w:hanging="360"/>
+      </w:pPr>
+      <w:rPr>
+        <w:rFonts w:ascii="Wingdings" w:hAnsi="Wingdings" w:hint="default"/>
+        <w:sz w:val="20"/>
+      </w:rPr>
+    </w:lvl>
+    <w:lvl w:ilvl="7" w:tentative="1">
+      <w:start w:val="1"/>
+      <w:numFmt w:val="bullet"/>
+      <w:lvlText w:val=""/>
+      <w:lvlJc w:val="left"/>
+      <w:pPr>
+        <w:tabs>
+          <w:tab w:val="num" w:pos="5760"/>
+        </w:tabs>
+        <w:ind w:left="5760" w:hanging="360"/>
+      </w:pPr>
+      <w:rPr>
+        <w:rFonts w:ascii="Wingdings" w:hAnsi="Wingdings" w:hint="default"/>
+        <w:sz w:val="20"/>
+      </w:rPr>
+    </w:lvl>
+    <w:lvl w:ilvl="8" w:tentative="1">
+      <w:start w:val="1"/>
+      <w:numFmt w:val="bullet"/>
+      <w:lvlText w:val=""/>
+      <w:lvlJc w:val="left"/>
+      <w:pPr>
+        <w:tabs>
+          <w:tab w:val="num" w:pos="6480"/>
+        </w:tabs>
+        <w:ind w:left="6480" w:hanging="360"/>
+      </w:pPr>
+      <w:rPr>
+        <w:rFonts w:ascii="Wingdings" w:hAnsi="Wingdings" w:hint="default"/>
+        <w:sz w:val="20"/>
+      </w:rPr>
+    </w:lvl>
+  </w:abstractNum>
+  <w:abstractNum w:abstractNumId="36" w15:restartNumberingAfterBreak="0">
     <w:nsid w:val="7DE05E93"/>
     <w:multiLevelType w:val="hybridMultilevel"/>
     <w:tmpl w:val="842ADD9A"/>
@@ -4536,85 +6147,112 @@
     <w:abstractNumId w:val="3"/>
   </w:num>
   <w:num w:numId="2" w16cid:durableId="1503008441">
-    <w:abstractNumId w:val="9"/>
+    <w:abstractNumId w:val="11"/>
   </w:num>
   <w:num w:numId="3" w16cid:durableId="1784570771">
-    <w:abstractNumId w:val="16"/>
+    <w:abstractNumId w:val="22"/>
   </w:num>
   <w:num w:numId="4" w16cid:durableId="883641885">
-    <w:abstractNumId w:val="24"/>
+    <w:abstractNumId w:val="31"/>
   </w:num>
   <w:num w:numId="5" w16cid:durableId="1555628575">
     <w:abstractNumId w:val="0"/>
   </w:num>
   <w:num w:numId="6" w16cid:durableId="269313866">
-    <w:abstractNumId w:val="22"/>
+    <w:abstractNumId w:val="29"/>
   </w:num>
   <w:num w:numId="7" w16cid:durableId="2121142197">
-    <w:abstractNumId w:val="27"/>
+    <w:abstractNumId w:val="36"/>
   </w:num>
   <w:num w:numId="8" w16cid:durableId="835531374">
-    <w:abstractNumId w:val="19"/>
+    <w:abstractNumId w:val="25"/>
   </w:num>
   <w:num w:numId="9" w16cid:durableId="309604504">
-    <w:abstractNumId w:val="26"/>
+    <w:abstractNumId w:val="34"/>
   </w:num>
   <w:num w:numId="10" w16cid:durableId="1909880886">
-    <w:abstractNumId w:val="14"/>
+    <w:abstractNumId w:val="20"/>
   </w:num>
   <w:num w:numId="11" w16cid:durableId="65347502">
-    <w:abstractNumId w:val="4"/>
+    <w:abstractNumId w:val="6"/>
   </w:num>
   <w:num w:numId="12" w16cid:durableId="1783765683">
-    <w:abstractNumId w:val="12"/>
+    <w:abstractNumId w:val="16"/>
   </w:num>
   <w:num w:numId="13" w16cid:durableId="2111657946">
     <w:abstractNumId w:val="2"/>
   </w:num>
   <w:num w:numId="14" w16cid:durableId="533733703">
-    <w:abstractNumId w:val="17"/>
+    <w:abstractNumId w:val="23"/>
   </w:num>
   <w:num w:numId="15" w16cid:durableId="733697034">
-    <w:abstractNumId w:val="5"/>
+    <w:abstractNumId w:val="7"/>
   </w:num>
   <w:num w:numId="16" w16cid:durableId="967246964">
-    <w:abstractNumId w:val="7"/>
+    <w:abstractNumId w:val="9"/>
   </w:num>
   <w:num w:numId="17" w16cid:durableId="328943739">
-    <w:abstractNumId w:val="8"/>
+    <w:abstractNumId w:val="10"/>
   </w:num>
   <w:num w:numId="18" w16cid:durableId="17045603">
+    <w:abstractNumId w:val="28"/>
+  </w:num>
+  <w:num w:numId="19" w16cid:durableId="1457484696">
+    <w:abstractNumId w:val="33"/>
+  </w:num>
+  <w:num w:numId="20" w16cid:durableId="1462460938">
     <w:abstractNumId w:val="21"/>
   </w:num>
-  <w:num w:numId="19" w16cid:durableId="1457484696">
-    <w:abstractNumId w:val="25"/>
+  <w:num w:numId="21" w16cid:durableId="1404372747">
+    <w:abstractNumId w:val="24"/>
   </w:num>
-  <w:num w:numId="20" w16cid:durableId="1462460938">
-    <w:abstractNumId w:val="15"/>
+  <w:num w:numId="22" w16cid:durableId="1039621528">
+    <w:abstractNumId w:val="30"/>
   </w:num>
-  <w:num w:numId="21" w16cid:durableId="1404372747">
+  <w:num w:numId="23" w16cid:durableId="582644198">
+    <w:abstractNumId w:val="14"/>
+  </w:num>
+  <w:num w:numId="24" w16cid:durableId="351414766">
     <w:abstractNumId w:val="18"/>
   </w:num>
-  <w:num w:numId="22" w16cid:durableId="1039621528">
-    <w:abstractNumId w:val="23"/>
-  </w:num>
-  <w:num w:numId="23" w16cid:durableId="582644198">
-    <w:abstractNumId w:val="11"/>
-  </w:num>
-  <w:num w:numId="24" w16cid:durableId="351414766">
-    <w:abstractNumId w:val="13"/>
-  </w:num>
   <w:num w:numId="25" w16cid:durableId="1285817984">
-    <w:abstractNumId w:val="6"/>
+    <w:abstractNumId w:val="8"/>
   </w:num>
   <w:num w:numId="26" w16cid:durableId="1908955791">
     <w:abstractNumId w:val="1"/>
   </w:num>
   <w:num w:numId="27" w16cid:durableId="740566290">
-    <w:abstractNumId w:val="20"/>
+    <w:abstractNumId w:val="27"/>
   </w:num>
   <w:num w:numId="28" w16cid:durableId="1106077866">
-    <w:abstractNumId w:val="10"/>
+    <w:abstractNumId w:val="13"/>
+  </w:num>
+  <w:num w:numId="29" w16cid:durableId="167327832">
+    <w:abstractNumId w:val="19"/>
+  </w:num>
+  <w:num w:numId="30" w16cid:durableId="111751977">
+    <w:abstractNumId w:val="17"/>
+  </w:num>
+  <w:num w:numId="31" w16cid:durableId="2134640040">
+    <w:abstractNumId w:val="15"/>
+  </w:num>
+  <w:num w:numId="32" w16cid:durableId="1936671866">
+    <w:abstractNumId w:val="12"/>
+  </w:num>
+  <w:num w:numId="33" w16cid:durableId="1487358299">
+    <w:abstractNumId w:val="26"/>
+  </w:num>
+  <w:num w:numId="34" w16cid:durableId="1068919638">
+    <w:abstractNumId w:val="35"/>
+  </w:num>
+  <w:num w:numId="35" w16cid:durableId="2105224181">
+    <w:abstractNumId w:val="32"/>
+  </w:num>
+  <w:num w:numId="36" w16cid:durableId="827596839">
+    <w:abstractNumId w:val="4"/>
+  </w:num>
+  <w:num w:numId="37" w16cid:durableId="1586183310">
+    <w:abstractNumId w:val="5"/>
   </w:num>
 </w:numbering>
 </file>
@@ -5066,7 +6704,6 @@
   <w:style w:type="character" w:default="1" w:styleId="Policepardfaut">
     <w:name w:val="Default Paragraph Font"/>
     <w:uiPriority w:val="1"/>
-    <w:semiHidden/>
     <w:unhideWhenUsed/>
   </w:style>
   <w:style w:type="table" w:default="1" w:styleId="TableauNormal">

</xml_diff>